<commit_message>
Integrated 9 pro features
</commit_message>
<xml_diff>
--- a/Explanation.docx
+++ b/Explanation.docx
@@ -11745,16 +11745,535 @@
       </w:r>
     </w:p>
     <w:p>
-      <w:r>
+      <w:pPr>
         <w:rPr>
           <w:rFonts w:ascii="Arial" w:hAnsi="Arial" w:cs="Arial"/>
           <w:color w:val="E3E3E3"/>
           <w:sz w:val="20"/>
           <w:shd w:val="clear" w:color="auto" w:fill="1E1F20"/>
         </w:rPr>
+      </w:pPr>
+      <w:r>
+        <w:rPr>
+          <w:rFonts w:ascii="Arial" w:hAnsi="Arial" w:cs="Arial"/>
+          <w:color w:val="E3E3E3"/>
+          <w:sz w:val="20"/>
+          <w:shd w:val="clear" w:color="auto" w:fill="1E1F20"/>
+        </w:rPr>
         <w:t>The full coding with build command</w:t>
       </w:r>
     </w:p>
+    <w:p>
+      <w:pPr>
+        <w:rPr>
+          <w:rFonts w:ascii="Arial" w:hAnsi="Arial" w:cs="Arial"/>
+          <w:color w:val="E3E3E3"/>
+          <w:sz w:val="20"/>
+          <w:shd w:val="clear" w:color="auto" w:fill="1E1F20"/>
+        </w:rPr>
+      </w:pPr>
+    </w:p>
+    <w:p>
+      <w:pPr>
+        <w:pStyle w:val="NormalWeb"/>
+      </w:pPr>
+      <w:r>
+        <w:t xml:space="preserve">That is the "Mission Accomplished" message of the </w:t>
+      </w:r>
+      <w:proofErr w:type="spellStart"/>
+      <w:r>
+        <w:t>Git</w:t>
+      </w:r>
+      <w:proofErr w:type="spellEnd"/>
+      <w:r>
+        <w:t xml:space="preserve"> world!</w:t>
+      </w:r>
+    </w:p>
+    <w:p>
+      <w:pPr>
+        <w:pStyle w:val="NormalWeb"/>
+      </w:pPr>
+      <w:r>
+        <w:t xml:space="preserve">Your </w:t>
+      </w:r>
+      <w:r>
+        <w:rPr>
+          <w:b/>
+          <w:bCs/>
+        </w:rPr>
+        <w:t>Office Task Merger</w:t>
+      </w:r>
+      <w:r>
+        <w:t xml:space="preserve"> source code and </w:t>
+      </w:r>
+      <w:r>
+        <w:rPr>
+          <w:rStyle w:val="HTMLCode"/>
+        </w:rPr>
+        <w:t>requirements.txt</w:t>
+      </w:r>
+      <w:r>
+        <w:t xml:space="preserve"> are now safely stored in your </w:t>
+      </w:r>
+      <w:proofErr w:type="spellStart"/>
+      <w:r>
+        <w:t>GitHub</w:t>
+      </w:r>
+      <w:proofErr w:type="spellEnd"/>
+      <w:r>
+        <w:t xml:space="preserve"> repository at </w:t>
+      </w:r>
+      <w:r>
+        <w:rPr>
+          <w:rStyle w:val="HTMLCode"/>
+        </w:rPr>
+        <w:t>https://github.com/AkashVerma1986/Office-Task-Merger</w:t>
+      </w:r>
+      <w:r>
+        <w:t>.</w:t>
+      </w:r>
+    </w:p>
+    <w:p>
+      <w:pPr>
+        <w:pStyle w:val="Heading3"/>
+      </w:pPr>
+      <w:r>
+        <w:t>What this means for you:</w:t>
+      </w:r>
+    </w:p>
+    <w:p>
+      <w:pPr>
+        <w:pStyle w:val="NormalWeb"/>
+        <w:numPr>
+          <w:ilvl w:val="0"/>
+          <w:numId w:val="15"/>
+        </w:numPr>
+      </w:pPr>
+      <w:r>
+        <w:rPr>
+          <w:b/>
+          <w:bCs/>
+        </w:rPr>
+        <w:t>Backup:</w:t>
+      </w:r>
+      <w:r>
+        <w:t xml:space="preserve"> Your hard work on the </w:t>
+      </w:r>
+      <w:r>
+        <w:rPr>
+          <w:rStyle w:val="HTMLCode"/>
+        </w:rPr>
+        <w:t>task.py</w:t>
+      </w:r>
+      <w:r>
+        <w:t xml:space="preserve"> logic and your custom environment settings are backed up.</w:t>
+      </w:r>
+    </w:p>
+    <w:p>
+      <w:pPr>
+        <w:pStyle w:val="NormalWeb"/>
+        <w:numPr>
+          <w:ilvl w:val="0"/>
+          <w:numId w:val="15"/>
+        </w:numPr>
+      </w:pPr>
+      <w:r>
+        <w:rPr>
+          <w:b/>
+          <w:bCs/>
+        </w:rPr>
+        <w:t>Portability:</w:t>
+      </w:r>
+      <w:r>
+        <w:t xml:space="preserve"> If you move to another office computer, you just need to </w:t>
+      </w:r>
+      <w:proofErr w:type="spellStart"/>
+      <w:r>
+        <w:rPr>
+          <w:rStyle w:val="HTMLCode"/>
+        </w:rPr>
+        <w:t>git</w:t>
+      </w:r>
+      <w:proofErr w:type="spellEnd"/>
+      <w:r>
+        <w:rPr>
+          <w:rStyle w:val="HTMLCode"/>
+        </w:rPr>
+        <w:t xml:space="preserve"> clone</w:t>
+      </w:r>
+      <w:r>
+        <w:t xml:space="preserve"> this repository and run </w:t>
+      </w:r>
+      <w:r>
+        <w:rPr>
+          <w:rStyle w:val="HTMLCode"/>
+        </w:rPr>
+        <w:t>pip install -r requirements.txt</w:t>
+      </w:r>
+      <w:r>
+        <w:t xml:space="preserve"> to be back in business.</w:t>
+      </w:r>
+    </w:p>
+    <w:p>
+      <w:pPr>
+        <w:pStyle w:val="NormalWeb"/>
+        <w:numPr>
+          <w:ilvl w:val="0"/>
+          <w:numId w:val="15"/>
+        </w:numPr>
+      </w:pPr>
+      <w:r>
+        <w:rPr>
+          <w:b/>
+          <w:bCs/>
+        </w:rPr>
+        <w:t>Version Control:</w:t>
+      </w:r>
+      <w:r>
+        <w:t xml:space="preserve"> From now on, whenever you make a change to your code, you just need to run:</w:t>
+      </w:r>
+    </w:p>
+    <w:p>
+      <w:pPr>
+        <w:pStyle w:val="NormalWeb"/>
+        <w:numPr>
+          <w:ilvl w:val="1"/>
+          <w:numId w:val="15"/>
+        </w:numPr>
+      </w:pPr>
+      <w:proofErr w:type="spellStart"/>
+      <w:proofErr w:type="gramStart"/>
+      <w:r>
+        <w:rPr>
+          <w:rStyle w:val="HTMLCode"/>
+        </w:rPr>
+        <w:t>git</w:t>
+      </w:r>
+      <w:proofErr w:type="spellEnd"/>
+      <w:proofErr w:type="gramEnd"/>
+      <w:r>
+        <w:rPr>
+          <w:rStyle w:val="HTMLCode"/>
+        </w:rPr>
+        <w:t xml:space="preserve"> add .</w:t>
+      </w:r>
+    </w:p>
+    <w:p>
+      <w:pPr>
+        <w:pStyle w:val="NormalWeb"/>
+        <w:numPr>
+          <w:ilvl w:val="1"/>
+          <w:numId w:val="15"/>
+        </w:numPr>
+      </w:pPr>
+      <w:proofErr w:type="spellStart"/>
+      <w:r>
+        <w:rPr>
+          <w:rStyle w:val="HTMLCode"/>
+        </w:rPr>
+        <w:t>git</w:t>
+      </w:r>
+      <w:proofErr w:type="spellEnd"/>
+      <w:r>
+        <w:rPr>
+          <w:rStyle w:val="HTMLCode"/>
+        </w:rPr>
+        <w:t xml:space="preserve"> commit -m "Describe what I changed"</w:t>
+      </w:r>
+    </w:p>
+    <w:p>
+      <w:pPr>
+        <w:pStyle w:val="NormalWeb"/>
+        <w:numPr>
+          <w:ilvl w:val="1"/>
+          <w:numId w:val="15"/>
+        </w:numPr>
+      </w:pPr>
+      <w:proofErr w:type="spellStart"/>
+      <w:r>
+        <w:rPr>
+          <w:rStyle w:val="HTMLCode"/>
+        </w:rPr>
+        <w:t>git</w:t>
+      </w:r>
+      <w:proofErr w:type="spellEnd"/>
+      <w:r>
+        <w:rPr>
+          <w:rStyle w:val="HTMLCode"/>
+        </w:rPr>
+        <w:t xml:space="preserve"> push</w:t>
+      </w:r>
+    </w:p>
+    <w:p>
+      <w:pPr>
+        <w:pStyle w:val="Heading3"/>
+      </w:pPr>
+    </w:p>
+    <w:p>
+      <w:pPr>
+        <w:pStyle w:val="Heading3"/>
+      </w:pPr>
+    </w:p>
+    <w:p>
+      <w:pPr>
+        <w:pStyle w:val="Heading3"/>
+      </w:pPr>
+    </w:p>
+    <w:p>
+      <w:pPr>
+        <w:pStyle w:val="Heading3"/>
+      </w:pPr>
+    </w:p>
+    <w:p>
+      <w:pPr>
+        <w:pStyle w:val="Heading3"/>
+      </w:pPr>
+    </w:p>
+    <w:p>
+      <w:pPr>
+        <w:pStyle w:val="Heading3"/>
+      </w:pPr>
+    </w:p>
+    <w:p>
+      <w:pPr>
+        <w:pStyle w:val="Heading3"/>
+      </w:pPr>
+    </w:p>
+    <w:p>
+      <w:pPr>
+        <w:pStyle w:val="Heading3"/>
+      </w:pPr>
+    </w:p>
+    <w:p>
+      <w:pPr>
+        <w:pStyle w:val="Heading3"/>
+      </w:pPr>
+    </w:p>
+    <w:p>
+      <w:pPr>
+        <w:pStyle w:val="Heading3"/>
+      </w:pPr>
+    </w:p>
+    <w:p>
+      <w:pPr>
+        <w:pStyle w:val="Heading3"/>
+      </w:pPr>
+      <w:r>
+        <w:t>1. Adding the "Regular or Major" Dropdown</w:t>
+      </w:r>
+    </w:p>
+    <w:p>
+      <w:pPr>
+        <w:pStyle w:val="NormalWeb"/>
+      </w:pPr>
+      <w:r>
+        <w:t xml:space="preserve">To include this, we will modify the </w:t>
+      </w:r>
+      <w:r>
+        <w:rPr>
+          <w:rStyle w:val="HTMLCode"/>
+        </w:rPr>
+        <w:t>actions</w:t>
+      </w:r>
+      <w:r>
+        <w:t xml:space="preserve"> frame within the </w:t>
+      </w:r>
+      <w:proofErr w:type="spellStart"/>
+      <w:r>
+        <w:rPr>
+          <w:rStyle w:val="HTMLCode"/>
+        </w:rPr>
+        <w:t>refresh_ui</w:t>
+      </w:r>
+      <w:proofErr w:type="spellEnd"/>
+      <w:r>
+        <w:t xml:space="preserve"> method. Currently, you have a "Note" entry and a "Completed" button. We will insert a small </w:t>
+      </w:r>
+      <w:proofErr w:type="spellStart"/>
+      <w:r>
+        <w:rPr>
+          <w:rStyle w:val="HTMLCode"/>
+        </w:rPr>
+        <w:t>CTkComboBox</w:t>
+      </w:r>
+      <w:proofErr w:type="spellEnd"/>
+      <w:r>
+        <w:t xml:space="preserve"> between them.</w:t>
+      </w:r>
+    </w:p>
+    <w:p>
+      <w:pPr>
+        <w:pStyle w:val="NormalWeb"/>
+      </w:pPr>
+      <w:r>
+        <w:rPr>
+          <w:b/>
+          <w:bCs/>
+        </w:rPr>
+        <w:t>The Logic:</w:t>
+      </w:r>
+    </w:p>
+    <w:p>
+      <w:pPr>
+        <w:pStyle w:val="NormalWeb"/>
+        <w:numPr>
+          <w:ilvl w:val="0"/>
+          <w:numId w:val="16"/>
+        </w:numPr>
+      </w:pPr>
+      <w:r>
+        <w:t xml:space="preserve">A new </w:t>
+      </w:r>
+      <w:proofErr w:type="spellStart"/>
+      <w:r>
+        <w:rPr>
+          <w:rStyle w:val="HTMLCode"/>
+        </w:rPr>
+        <w:t>self.completion_types</w:t>
+      </w:r>
+      <w:proofErr w:type="spellEnd"/>
+      <w:r>
+        <w:t xml:space="preserve"> dictionary will store the value of this dropdown for each task.</w:t>
+      </w:r>
+    </w:p>
+    <w:p>
+      <w:pPr>
+        <w:pStyle w:val="NormalWeb"/>
+        <w:numPr>
+          <w:ilvl w:val="0"/>
+          <w:numId w:val="16"/>
+        </w:numPr>
+      </w:pPr>
+      <w:r>
+        <w:t>When "Completed" is clicked, the selected value (Regular/Major) will be sent to Firebase along with your note.</w:t>
+      </w:r>
+    </w:p>
+    <w:p>
+      <w:pPr>
+        <w:pStyle w:val="Heading3"/>
+      </w:pPr>
+      <w:r>
+        <w:t>2. Fixing the Time Display</w:t>
+      </w:r>
+    </w:p>
+    <w:p>
+      <w:pPr>
+        <w:pStyle w:val="NormalWeb"/>
+      </w:pPr>
+      <w:r>
+        <w:t xml:space="preserve">If the time is showing incorrectly (e.g., wrong </w:t>
+      </w:r>
+      <w:proofErr w:type="spellStart"/>
+      <w:r>
+        <w:t>timezone</w:t>
+      </w:r>
+      <w:proofErr w:type="spellEnd"/>
+      <w:r>
+        <w:t xml:space="preserve"> or static time), it is likely because </w:t>
+      </w:r>
+      <w:proofErr w:type="spellStart"/>
+      <w:proofErr w:type="gramStart"/>
+      <w:r>
+        <w:rPr>
+          <w:rStyle w:val="HTMLCode"/>
+        </w:rPr>
+        <w:t>datetime.now</w:t>
+      </w:r>
+      <w:proofErr w:type="spellEnd"/>
+      <w:r>
+        <w:rPr>
+          <w:rStyle w:val="HTMLCode"/>
+        </w:rPr>
+        <w:t>(</w:t>
+      </w:r>
+      <w:proofErr w:type="gramEnd"/>
+      <w:r>
+        <w:rPr>
+          <w:rStyle w:val="HTMLCode"/>
+        </w:rPr>
+        <w:t>)</w:t>
+      </w:r>
+      <w:r>
+        <w:t xml:space="preserve"> needs to be called at the exact moment of the click, and the formatting string must match between the "Add" and "Display" functions.</w:t>
+      </w:r>
+    </w:p>
+    <w:p/>
+    <w:p/>
+    <w:p/>
+    <w:p>
+      <w:pPr>
+        <w:pStyle w:val="NormalWeb"/>
+      </w:pPr>
+    </w:p>
+    <w:p>
+      <w:pPr>
+        <w:pStyle w:val="NormalWeb"/>
+      </w:pPr>
+    </w:p>
+    <w:p>
+      <w:pPr>
+        <w:pStyle w:val="NormalWeb"/>
+      </w:pPr>
+    </w:p>
+    <w:p>
+      <w:pPr>
+        <w:pStyle w:val="NormalWeb"/>
+      </w:pPr>
+    </w:p>
+    <w:p>
+      <w:pPr>
+        <w:pStyle w:val="NormalWeb"/>
+      </w:pPr>
+      <w:r>
+        <w:lastRenderedPageBreak/>
+        <w:t xml:space="preserve">Adding an edit feature to a live-syncing Firebase application </w:t>
+      </w:r>
+      <w:proofErr w:type="gramStart"/>
+      <w:r>
+        <w:t>requires a "</w:t>
+      </w:r>
+      <w:proofErr w:type="gramEnd"/>
+      <w:r>
+        <w:t>Switch" logic: we need to turn the static task labels into editable input fields temporarily, then "Save" those changes back to the database.</w:t>
+      </w:r>
+    </w:p>
+    <w:p>
+      <w:pPr>
+        <w:pStyle w:val="NormalWeb"/>
+      </w:pPr>
+      <w:r>
+        <w:t xml:space="preserve">I have updated the code to include an </w:t>
+      </w:r>
+      <w:r>
+        <w:rPr>
+          <w:b/>
+          <w:bCs/>
+        </w:rPr>
+        <w:t>"Edit" button</w:t>
+      </w:r>
+      <w:r>
+        <w:t xml:space="preserve"> (represented by a </w:t>
+      </w:r>
+      <w:r>
+        <w:rPr>
+          <w:rStyle w:val="HTMLCode"/>
+          <w:rFonts w:ascii="MS Mincho" w:eastAsia="MS Mincho" w:hAnsi="MS Mincho" w:cs="MS Mincho" w:hint="eastAsia"/>
+        </w:rPr>
+        <w:t>✎</w:t>
+      </w:r>
+      <w:r>
+        <w:t xml:space="preserve"> icon). When clicked, it opens a simple dialog allowing you to fix the Finance name or the Task description.</w:t>
+      </w:r>
+    </w:p>
+    <w:p>
+      <w:pPr>
+        <w:pStyle w:val="Heading3"/>
+      </w:pPr>
+      <w:r>
+        <w:t>Updated Full Code (v2.1)</w:t>
+      </w:r>
+    </w:p>
+    <w:p/>
     <w:sectPr>
       <w:pgSz w:w="11906" w:h="16838"/>
       <w:pgMar w:top="1440" w:right="1440" w:bottom="1440" w:left="1440" w:header="708" w:footer="708" w:gutter="0"/>
@@ -11917,9 +12436,9 @@
     </w:lvl>
   </w:abstractNum>
   <w:abstractNum w:abstractNumId="1">
-    <w:nsid w:val="2CC006E1"/>
+    <w:nsid w:val="2C056ECF"/>
     <w:multiLevelType w:val="multilevel"/>
-    <w:tmpl w:val="220469BA"/>
+    <w:tmpl w:val="895AE318"/>
     <w:lvl w:ilvl="0">
       <w:start w:val="1"/>
       <w:numFmt w:val="bullet"/>
@@ -12066,9 +12585,9 @@
     </w:lvl>
   </w:abstractNum>
   <w:abstractNum w:abstractNumId="2">
-    <w:nsid w:val="2D5558F5"/>
+    <w:nsid w:val="2CC006E1"/>
     <w:multiLevelType w:val="multilevel"/>
-    <w:tmpl w:val="089CAC44"/>
+    <w:tmpl w:val="220469BA"/>
     <w:lvl w:ilvl="0">
       <w:start w:val="1"/>
       <w:numFmt w:val="bullet"/>
@@ -12215,122 +12734,9 @@
     </w:lvl>
   </w:abstractNum>
   <w:abstractNum w:abstractNumId="3">
-    <w:nsid w:val="33835B5B"/>
+    <w:nsid w:val="2D5558F5"/>
     <w:multiLevelType w:val="multilevel"/>
-    <w:tmpl w:val="0DEA12BA"/>
-    <w:lvl w:ilvl="0">
-      <w:start w:val="1"/>
-      <w:numFmt w:val="decimal"/>
-      <w:lvlText w:val="%1."/>
-      <w:lvlJc w:val="left"/>
-      <w:pPr>
-        <w:tabs>
-          <w:tab w:val="num" w:pos="720"/>
-        </w:tabs>
-        <w:ind w:left="720" w:hanging="360"/>
-      </w:pPr>
-    </w:lvl>
-    <w:lvl w:ilvl="1" w:tentative="1">
-      <w:start w:val="1"/>
-      <w:numFmt w:val="decimal"/>
-      <w:lvlText w:val="%2."/>
-      <w:lvlJc w:val="left"/>
-      <w:pPr>
-        <w:tabs>
-          <w:tab w:val="num" w:pos="1440"/>
-        </w:tabs>
-        <w:ind w:left="1440" w:hanging="360"/>
-      </w:pPr>
-    </w:lvl>
-    <w:lvl w:ilvl="2" w:tentative="1">
-      <w:start w:val="1"/>
-      <w:numFmt w:val="decimal"/>
-      <w:lvlText w:val="%3."/>
-      <w:lvlJc w:val="left"/>
-      <w:pPr>
-        <w:tabs>
-          <w:tab w:val="num" w:pos="2160"/>
-        </w:tabs>
-        <w:ind w:left="2160" w:hanging="360"/>
-      </w:pPr>
-    </w:lvl>
-    <w:lvl w:ilvl="3" w:tentative="1">
-      <w:start w:val="1"/>
-      <w:numFmt w:val="decimal"/>
-      <w:lvlText w:val="%4."/>
-      <w:lvlJc w:val="left"/>
-      <w:pPr>
-        <w:tabs>
-          <w:tab w:val="num" w:pos="2880"/>
-        </w:tabs>
-        <w:ind w:left="2880" w:hanging="360"/>
-      </w:pPr>
-    </w:lvl>
-    <w:lvl w:ilvl="4" w:tentative="1">
-      <w:start w:val="1"/>
-      <w:numFmt w:val="decimal"/>
-      <w:lvlText w:val="%5."/>
-      <w:lvlJc w:val="left"/>
-      <w:pPr>
-        <w:tabs>
-          <w:tab w:val="num" w:pos="3600"/>
-        </w:tabs>
-        <w:ind w:left="3600" w:hanging="360"/>
-      </w:pPr>
-    </w:lvl>
-    <w:lvl w:ilvl="5" w:tentative="1">
-      <w:start w:val="1"/>
-      <w:numFmt w:val="decimal"/>
-      <w:lvlText w:val="%6."/>
-      <w:lvlJc w:val="left"/>
-      <w:pPr>
-        <w:tabs>
-          <w:tab w:val="num" w:pos="4320"/>
-        </w:tabs>
-        <w:ind w:left="4320" w:hanging="360"/>
-      </w:pPr>
-    </w:lvl>
-    <w:lvl w:ilvl="6" w:tentative="1">
-      <w:start w:val="1"/>
-      <w:numFmt w:val="decimal"/>
-      <w:lvlText w:val="%7."/>
-      <w:lvlJc w:val="left"/>
-      <w:pPr>
-        <w:tabs>
-          <w:tab w:val="num" w:pos="5040"/>
-        </w:tabs>
-        <w:ind w:left="5040" w:hanging="360"/>
-      </w:pPr>
-    </w:lvl>
-    <w:lvl w:ilvl="7" w:tentative="1">
-      <w:start w:val="1"/>
-      <w:numFmt w:val="decimal"/>
-      <w:lvlText w:val="%8."/>
-      <w:lvlJc w:val="left"/>
-      <w:pPr>
-        <w:tabs>
-          <w:tab w:val="num" w:pos="5760"/>
-        </w:tabs>
-        <w:ind w:left="5760" w:hanging="360"/>
-      </w:pPr>
-    </w:lvl>
-    <w:lvl w:ilvl="8" w:tentative="1">
-      <w:start w:val="1"/>
-      <w:numFmt w:val="decimal"/>
-      <w:lvlText w:val="%9."/>
-      <w:lvlJc w:val="left"/>
-      <w:pPr>
-        <w:tabs>
-          <w:tab w:val="num" w:pos="6480"/>
-        </w:tabs>
-        <w:ind w:left="6480" w:hanging="360"/>
-      </w:pPr>
-    </w:lvl>
-  </w:abstractNum>
-  <w:abstractNum w:abstractNumId="4">
-    <w:nsid w:val="3B167A9F"/>
-    <w:multiLevelType w:val="multilevel"/>
-    <w:tmpl w:val="FF3C6BE0"/>
+    <w:tmpl w:val="089CAC44"/>
     <w:lvl w:ilvl="0">
       <w:start w:val="1"/>
       <w:numFmt w:val="bullet"/>
@@ -12476,10 +12882,268 @@
       </w:rPr>
     </w:lvl>
   </w:abstractNum>
+  <w:abstractNum w:abstractNumId="4">
+    <w:nsid w:val="331D24DD"/>
+    <w:multiLevelType w:val="multilevel"/>
+    <w:tmpl w:val="D1E28194"/>
+    <w:lvl w:ilvl="0">
+      <w:start w:val="1"/>
+      <w:numFmt w:val="bullet"/>
+      <w:lvlText w:val=""/>
+      <w:lvlJc w:val="left"/>
+      <w:pPr>
+        <w:tabs>
+          <w:tab w:val="num" w:pos="720"/>
+        </w:tabs>
+        <w:ind w:left="720" w:hanging="360"/>
+      </w:pPr>
+      <w:rPr>
+        <w:rFonts w:ascii="Symbol" w:hAnsi="Symbol" w:hint="default"/>
+        <w:sz w:val="20"/>
+      </w:rPr>
+    </w:lvl>
+    <w:lvl w:ilvl="1">
+      <w:start w:val="1"/>
+      <w:numFmt w:val="decimal"/>
+      <w:lvlText w:val="%2."/>
+      <w:lvlJc w:val="left"/>
+      <w:pPr>
+        <w:tabs>
+          <w:tab w:val="num" w:pos="1440"/>
+        </w:tabs>
+        <w:ind w:left="1440" w:hanging="360"/>
+      </w:pPr>
+    </w:lvl>
+    <w:lvl w:ilvl="2" w:tentative="1">
+      <w:start w:val="1"/>
+      <w:numFmt w:val="bullet"/>
+      <w:lvlText w:val=""/>
+      <w:lvlJc w:val="left"/>
+      <w:pPr>
+        <w:tabs>
+          <w:tab w:val="num" w:pos="2160"/>
+        </w:tabs>
+        <w:ind w:left="2160" w:hanging="360"/>
+      </w:pPr>
+      <w:rPr>
+        <w:rFonts w:ascii="Wingdings" w:hAnsi="Wingdings" w:hint="default"/>
+        <w:sz w:val="20"/>
+      </w:rPr>
+    </w:lvl>
+    <w:lvl w:ilvl="3" w:tentative="1">
+      <w:start w:val="1"/>
+      <w:numFmt w:val="bullet"/>
+      <w:lvlText w:val=""/>
+      <w:lvlJc w:val="left"/>
+      <w:pPr>
+        <w:tabs>
+          <w:tab w:val="num" w:pos="2880"/>
+        </w:tabs>
+        <w:ind w:left="2880" w:hanging="360"/>
+      </w:pPr>
+      <w:rPr>
+        <w:rFonts w:ascii="Wingdings" w:hAnsi="Wingdings" w:hint="default"/>
+        <w:sz w:val="20"/>
+      </w:rPr>
+    </w:lvl>
+    <w:lvl w:ilvl="4" w:tentative="1">
+      <w:start w:val="1"/>
+      <w:numFmt w:val="bullet"/>
+      <w:lvlText w:val=""/>
+      <w:lvlJc w:val="left"/>
+      <w:pPr>
+        <w:tabs>
+          <w:tab w:val="num" w:pos="3600"/>
+        </w:tabs>
+        <w:ind w:left="3600" w:hanging="360"/>
+      </w:pPr>
+      <w:rPr>
+        <w:rFonts w:ascii="Wingdings" w:hAnsi="Wingdings" w:hint="default"/>
+        <w:sz w:val="20"/>
+      </w:rPr>
+    </w:lvl>
+    <w:lvl w:ilvl="5" w:tentative="1">
+      <w:start w:val="1"/>
+      <w:numFmt w:val="bullet"/>
+      <w:lvlText w:val=""/>
+      <w:lvlJc w:val="left"/>
+      <w:pPr>
+        <w:tabs>
+          <w:tab w:val="num" w:pos="4320"/>
+        </w:tabs>
+        <w:ind w:left="4320" w:hanging="360"/>
+      </w:pPr>
+      <w:rPr>
+        <w:rFonts w:ascii="Wingdings" w:hAnsi="Wingdings" w:hint="default"/>
+        <w:sz w:val="20"/>
+      </w:rPr>
+    </w:lvl>
+    <w:lvl w:ilvl="6" w:tentative="1">
+      <w:start w:val="1"/>
+      <w:numFmt w:val="bullet"/>
+      <w:lvlText w:val=""/>
+      <w:lvlJc w:val="left"/>
+      <w:pPr>
+        <w:tabs>
+          <w:tab w:val="num" w:pos="5040"/>
+        </w:tabs>
+        <w:ind w:left="5040" w:hanging="360"/>
+      </w:pPr>
+      <w:rPr>
+        <w:rFonts w:ascii="Wingdings" w:hAnsi="Wingdings" w:hint="default"/>
+        <w:sz w:val="20"/>
+      </w:rPr>
+    </w:lvl>
+    <w:lvl w:ilvl="7" w:tentative="1">
+      <w:start w:val="1"/>
+      <w:numFmt w:val="bullet"/>
+      <w:lvlText w:val=""/>
+      <w:lvlJc w:val="left"/>
+      <w:pPr>
+        <w:tabs>
+          <w:tab w:val="num" w:pos="5760"/>
+        </w:tabs>
+        <w:ind w:left="5760" w:hanging="360"/>
+      </w:pPr>
+      <w:rPr>
+        <w:rFonts w:ascii="Wingdings" w:hAnsi="Wingdings" w:hint="default"/>
+        <w:sz w:val="20"/>
+      </w:rPr>
+    </w:lvl>
+    <w:lvl w:ilvl="8" w:tentative="1">
+      <w:start w:val="1"/>
+      <w:numFmt w:val="bullet"/>
+      <w:lvlText w:val=""/>
+      <w:lvlJc w:val="left"/>
+      <w:pPr>
+        <w:tabs>
+          <w:tab w:val="num" w:pos="6480"/>
+        </w:tabs>
+        <w:ind w:left="6480" w:hanging="360"/>
+      </w:pPr>
+      <w:rPr>
+        <w:rFonts w:ascii="Wingdings" w:hAnsi="Wingdings" w:hint="default"/>
+        <w:sz w:val="20"/>
+      </w:rPr>
+    </w:lvl>
+  </w:abstractNum>
   <w:abstractNum w:abstractNumId="5">
-    <w:nsid w:val="4BE67943"/>
+    <w:nsid w:val="33835B5B"/>
     <w:multiLevelType w:val="multilevel"/>
-    <w:tmpl w:val="849CBBAE"/>
+    <w:tmpl w:val="0DEA12BA"/>
+    <w:lvl w:ilvl="0">
+      <w:start w:val="1"/>
+      <w:numFmt w:val="decimal"/>
+      <w:lvlText w:val="%1."/>
+      <w:lvlJc w:val="left"/>
+      <w:pPr>
+        <w:tabs>
+          <w:tab w:val="num" w:pos="720"/>
+        </w:tabs>
+        <w:ind w:left="720" w:hanging="360"/>
+      </w:pPr>
+    </w:lvl>
+    <w:lvl w:ilvl="1" w:tentative="1">
+      <w:start w:val="1"/>
+      <w:numFmt w:val="decimal"/>
+      <w:lvlText w:val="%2."/>
+      <w:lvlJc w:val="left"/>
+      <w:pPr>
+        <w:tabs>
+          <w:tab w:val="num" w:pos="1440"/>
+        </w:tabs>
+        <w:ind w:left="1440" w:hanging="360"/>
+      </w:pPr>
+    </w:lvl>
+    <w:lvl w:ilvl="2" w:tentative="1">
+      <w:start w:val="1"/>
+      <w:numFmt w:val="decimal"/>
+      <w:lvlText w:val="%3."/>
+      <w:lvlJc w:val="left"/>
+      <w:pPr>
+        <w:tabs>
+          <w:tab w:val="num" w:pos="2160"/>
+        </w:tabs>
+        <w:ind w:left="2160" w:hanging="360"/>
+      </w:pPr>
+    </w:lvl>
+    <w:lvl w:ilvl="3" w:tentative="1">
+      <w:start w:val="1"/>
+      <w:numFmt w:val="decimal"/>
+      <w:lvlText w:val="%4."/>
+      <w:lvlJc w:val="left"/>
+      <w:pPr>
+        <w:tabs>
+          <w:tab w:val="num" w:pos="2880"/>
+        </w:tabs>
+        <w:ind w:left="2880" w:hanging="360"/>
+      </w:pPr>
+    </w:lvl>
+    <w:lvl w:ilvl="4" w:tentative="1">
+      <w:start w:val="1"/>
+      <w:numFmt w:val="decimal"/>
+      <w:lvlText w:val="%5."/>
+      <w:lvlJc w:val="left"/>
+      <w:pPr>
+        <w:tabs>
+          <w:tab w:val="num" w:pos="3600"/>
+        </w:tabs>
+        <w:ind w:left="3600" w:hanging="360"/>
+      </w:pPr>
+    </w:lvl>
+    <w:lvl w:ilvl="5" w:tentative="1">
+      <w:start w:val="1"/>
+      <w:numFmt w:val="decimal"/>
+      <w:lvlText w:val="%6."/>
+      <w:lvlJc w:val="left"/>
+      <w:pPr>
+        <w:tabs>
+          <w:tab w:val="num" w:pos="4320"/>
+        </w:tabs>
+        <w:ind w:left="4320" w:hanging="360"/>
+      </w:pPr>
+    </w:lvl>
+    <w:lvl w:ilvl="6" w:tentative="1">
+      <w:start w:val="1"/>
+      <w:numFmt w:val="decimal"/>
+      <w:lvlText w:val="%7."/>
+      <w:lvlJc w:val="left"/>
+      <w:pPr>
+        <w:tabs>
+          <w:tab w:val="num" w:pos="5040"/>
+        </w:tabs>
+        <w:ind w:left="5040" w:hanging="360"/>
+      </w:pPr>
+    </w:lvl>
+    <w:lvl w:ilvl="7" w:tentative="1">
+      <w:start w:val="1"/>
+      <w:numFmt w:val="decimal"/>
+      <w:lvlText w:val="%8."/>
+      <w:lvlJc w:val="left"/>
+      <w:pPr>
+        <w:tabs>
+          <w:tab w:val="num" w:pos="5760"/>
+        </w:tabs>
+        <w:ind w:left="5760" w:hanging="360"/>
+      </w:pPr>
+    </w:lvl>
+    <w:lvl w:ilvl="8" w:tentative="1">
+      <w:start w:val="1"/>
+      <w:numFmt w:val="decimal"/>
+      <w:lvlText w:val="%9."/>
+      <w:lvlJc w:val="left"/>
+      <w:pPr>
+        <w:tabs>
+          <w:tab w:val="num" w:pos="6480"/>
+        </w:tabs>
+        <w:ind w:left="6480" w:hanging="360"/>
+      </w:pPr>
+    </w:lvl>
+  </w:abstractNum>
+  <w:abstractNum w:abstractNumId="6">
+    <w:nsid w:val="3B167A9F"/>
+    <w:multiLevelType w:val="multilevel"/>
+    <w:tmpl w:val="FF3C6BE0"/>
     <w:lvl w:ilvl="0">
       <w:start w:val="1"/>
       <w:numFmt w:val="bullet"/>
@@ -12625,10 +13289,10 @@
       </w:rPr>
     </w:lvl>
   </w:abstractNum>
-  <w:abstractNum w:abstractNumId="6">
-    <w:nsid w:val="4D1729E4"/>
+  <w:abstractNum w:abstractNumId="7">
+    <w:nsid w:val="4BE67943"/>
     <w:multiLevelType w:val="multilevel"/>
-    <w:tmpl w:val="7D86028E"/>
+    <w:tmpl w:val="849CBBAE"/>
     <w:lvl w:ilvl="0">
       <w:start w:val="1"/>
       <w:numFmt w:val="bullet"/>
@@ -12774,10 +13438,10 @@
       </w:rPr>
     </w:lvl>
   </w:abstractNum>
-  <w:abstractNum w:abstractNumId="7">
-    <w:nsid w:val="4DE504D0"/>
+  <w:abstractNum w:abstractNumId="8">
+    <w:nsid w:val="4D1729E4"/>
     <w:multiLevelType w:val="multilevel"/>
-    <w:tmpl w:val="AF328F58"/>
+    <w:tmpl w:val="7D86028E"/>
     <w:lvl w:ilvl="0">
       <w:start w:val="1"/>
       <w:numFmt w:val="bullet"/>
@@ -12923,10 +13587,10 @@
       </w:rPr>
     </w:lvl>
   </w:abstractNum>
-  <w:abstractNum w:abstractNumId="8">
-    <w:nsid w:val="509B0FC5"/>
+  <w:abstractNum w:abstractNumId="9">
+    <w:nsid w:val="4DE504D0"/>
     <w:multiLevelType w:val="multilevel"/>
-    <w:tmpl w:val="3BA816F8"/>
+    <w:tmpl w:val="AF328F58"/>
     <w:lvl w:ilvl="0">
       <w:start w:val="1"/>
       <w:numFmt w:val="bullet"/>
@@ -13072,7 +13736,156 @@
       </w:rPr>
     </w:lvl>
   </w:abstractNum>
-  <w:abstractNum w:abstractNumId="9">
+  <w:abstractNum w:abstractNumId="10">
+    <w:nsid w:val="509B0FC5"/>
+    <w:multiLevelType w:val="multilevel"/>
+    <w:tmpl w:val="3BA816F8"/>
+    <w:lvl w:ilvl="0">
+      <w:start w:val="1"/>
+      <w:numFmt w:val="bullet"/>
+      <w:lvlText w:val=""/>
+      <w:lvlJc w:val="left"/>
+      <w:pPr>
+        <w:tabs>
+          <w:tab w:val="num" w:pos="720"/>
+        </w:tabs>
+        <w:ind w:left="720" w:hanging="360"/>
+      </w:pPr>
+      <w:rPr>
+        <w:rFonts w:ascii="Symbol" w:hAnsi="Symbol" w:hint="default"/>
+        <w:sz w:val="20"/>
+      </w:rPr>
+    </w:lvl>
+    <w:lvl w:ilvl="1" w:tentative="1">
+      <w:start w:val="1"/>
+      <w:numFmt w:val="bullet"/>
+      <w:lvlText w:val="o"/>
+      <w:lvlJc w:val="left"/>
+      <w:pPr>
+        <w:tabs>
+          <w:tab w:val="num" w:pos="1440"/>
+        </w:tabs>
+        <w:ind w:left="1440" w:hanging="360"/>
+      </w:pPr>
+      <w:rPr>
+        <w:rFonts w:ascii="Courier New" w:hAnsi="Courier New" w:hint="default"/>
+        <w:sz w:val="20"/>
+      </w:rPr>
+    </w:lvl>
+    <w:lvl w:ilvl="2" w:tentative="1">
+      <w:start w:val="1"/>
+      <w:numFmt w:val="bullet"/>
+      <w:lvlText w:val=""/>
+      <w:lvlJc w:val="left"/>
+      <w:pPr>
+        <w:tabs>
+          <w:tab w:val="num" w:pos="2160"/>
+        </w:tabs>
+        <w:ind w:left="2160" w:hanging="360"/>
+      </w:pPr>
+      <w:rPr>
+        <w:rFonts w:ascii="Wingdings" w:hAnsi="Wingdings" w:hint="default"/>
+        <w:sz w:val="20"/>
+      </w:rPr>
+    </w:lvl>
+    <w:lvl w:ilvl="3" w:tentative="1">
+      <w:start w:val="1"/>
+      <w:numFmt w:val="bullet"/>
+      <w:lvlText w:val=""/>
+      <w:lvlJc w:val="left"/>
+      <w:pPr>
+        <w:tabs>
+          <w:tab w:val="num" w:pos="2880"/>
+        </w:tabs>
+        <w:ind w:left="2880" w:hanging="360"/>
+      </w:pPr>
+      <w:rPr>
+        <w:rFonts w:ascii="Wingdings" w:hAnsi="Wingdings" w:hint="default"/>
+        <w:sz w:val="20"/>
+      </w:rPr>
+    </w:lvl>
+    <w:lvl w:ilvl="4" w:tentative="1">
+      <w:start w:val="1"/>
+      <w:numFmt w:val="bullet"/>
+      <w:lvlText w:val=""/>
+      <w:lvlJc w:val="left"/>
+      <w:pPr>
+        <w:tabs>
+          <w:tab w:val="num" w:pos="3600"/>
+        </w:tabs>
+        <w:ind w:left="3600" w:hanging="360"/>
+      </w:pPr>
+      <w:rPr>
+        <w:rFonts w:ascii="Wingdings" w:hAnsi="Wingdings" w:hint="default"/>
+        <w:sz w:val="20"/>
+      </w:rPr>
+    </w:lvl>
+    <w:lvl w:ilvl="5" w:tentative="1">
+      <w:start w:val="1"/>
+      <w:numFmt w:val="bullet"/>
+      <w:lvlText w:val=""/>
+      <w:lvlJc w:val="left"/>
+      <w:pPr>
+        <w:tabs>
+          <w:tab w:val="num" w:pos="4320"/>
+        </w:tabs>
+        <w:ind w:left="4320" w:hanging="360"/>
+      </w:pPr>
+      <w:rPr>
+        <w:rFonts w:ascii="Wingdings" w:hAnsi="Wingdings" w:hint="default"/>
+        <w:sz w:val="20"/>
+      </w:rPr>
+    </w:lvl>
+    <w:lvl w:ilvl="6" w:tentative="1">
+      <w:start w:val="1"/>
+      <w:numFmt w:val="bullet"/>
+      <w:lvlText w:val=""/>
+      <w:lvlJc w:val="left"/>
+      <w:pPr>
+        <w:tabs>
+          <w:tab w:val="num" w:pos="5040"/>
+        </w:tabs>
+        <w:ind w:left="5040" w:hanging="360"/>
+      </w:pPr>
+      <w:rPr>
+        <w:rFonts w:ascii="Wingdings" w:hAnsi="Wingdings" w:hint="default"/>
+        <w:sz w:val="20"/>
+      </w:rPr>
+    </w:lvl>
+    <w:lvl w:ilvl="7" w:tentative="1">
+      <w:start w:val="1"/>
+      <w:numFmt w:val="bullet"/>
+      <w:lvlText w:val=""/>
+      <w:lvlJc w:val="left"/>
+      <w:pPr>
+        <w:tabs>
+          <w:tab w:val="num" w:pos="5760"/>
+        </w:tabs>
+        <w:ind w:left="5760" w:hanging="360"/>
+      </w:pPr>
+      <w:rPr>
+        <w:rFonts w:ascii="Wingdings" w:hAnsi="Wingdings" w:hint="default"/>
+        <w:sz w:val="20"/>
+      </w:rPr>
+    </w:lvl>
+    <w:lvl w:ilvl="8" w:tentative="1">
+      <w:start w:val="1"/>
+      <w:numFmt w:val="bullet"/>
+      <w:lvlText w:val=""/>
+      <w:lvlJc w:val="left"/>
+      <w:pPr>
+        <w:tabs>
+          <w:tab w:val="num" w:pos="6480"/>
+        </w:tabs>
+        <w:ind w:left="6480" w:hanging="360"/>
+      </w:pPr>
+      <w:rPr>
+        <w:rFonts w:ascii="Wingdings" w:hAnsi="Wingdings" w:hint="default"/>
+        <w:sz w:val="20"/>
+      </w:rPr>
+    </w:lvl>
+  </w:abstractNum>
+  <w:abstractNum w:abstractNumId="11">
     <w:nsid w:val="5DF30A33"/>
     <w:multiLevelType w:val="multilevel"/>
     <w:tmpl w:val="F5F8CBCA"/>
@@ -13189,7 +14002,7 @@
       </w:pPr>
     </w:lvl>
   </w:abstractNum>
-  <w:abstractNum w:abstractNumId="10">
+  <w:abstractNum w:abstractNumId="12">
     <w:nsid w:val="64EC0092"/>
     <w:multiLevelType w:val="multilevel"/>
     <w:tmpl w:val="D88E7B7E"/>
@@ -13338,7 +14151,7 @@
       </w:rPr>
     </w:lvl>
   </w:abstractNum>
-  <w:abstractNum w:abstractNumId="11">
+  <w:abstractNum w:abstractNumId="13">
     <w:nsid w:val="6A4809B5"/>
     <w:multiLevelType w:val="multilevel"/>
     <w:tmpl w:val="1E1C82E8"/>
@@ -13487,7 +14300,7 @@
       </w:rPr>
     </w:lvl>
   </w:abstractNum>
-  <w:abstractNum w:abstractNumId="12">
+  <w:abstractNum w:abstractNumId="14">
     <w:nsid w:val="79BB5B10"/>
     <w:multiLevelType w:val="multilevel"/>
     <w:tmpl w:val="7F984CDE"/>
@@ -13636,7 +14449,7 @@
       </w:rPr>
     </w:lvl>
   </w:abstractNum>
-  <w:abstractNum w:abstractNumId="13">
+  <w:abstractNum w:abstractNumId="15">
     <w:nsid w:val="7D101A7E"/>
     <w:multiLevelType w:val="multilevel"/>
     <w:tmpl w:val="164EF1B2"/>
@@ -13786,46 +14599,52 @@
     </w:lvl>
   </w:abstractNum>
   <w:num w:numId="1">
-    <w:abstractNumId w:val="10"/>
+    <w:abstractNumId w:val="12"/>
   </w:num>
   <w:num w:numId="2">
-    <w:abstractNumId w:val="12"/>
+    <w:abstractNumId w:val="14"/>
   </w:num>
   <w:num w:numId="3">
     <w:abstractNumId w:val="0"/>
   </w:num>
   <w:num w:numId="4">
+    <w:abstractNumId w:val="8"/>
+  </w:num>
+  <w:num w:numId="5">
+    <w:abstractNumId w:val="5"/>
+  </w:num>
+  <w:num w:numId="6">
+    <w:abstractNumId w:val="13"/>
+  </w:num>
+  <w:num w:numId="7">
+    <w:abstractNumId w:val="11"/>
+  </w:num>
+  <w:num w:numId="8">
+    <w:abstractNumId w:val="7"/>
+  </w:num>
+  <w:num w:numId="9">
+    <w:abstractNumId w:val="3"/>
+  </w:num>
+  <w:num w:numId="10">
+    <w:abstractNumId w:val="2"/>
+  </w:num>
+  <w:num w:numId="11">
+    <w:abstractNumId w:val="10"/>
+  </w:num>
+  <w:num w:numId="12">
     <w:abstractNumId w:val="6"/>
   </w:num>
-  <w:num w:numId="5">
-    <w:abstractNumId w:val="3"/>
-  </w:num>
-  <w:num w:numId="6">
-    <w:abstractNumId w:val="11"/>
-  </w:num>
-  <w:num w:numId="7">
+  <w:num w:numId="13">
     <w:abstractNumId w:val="9"/>
   </w:num>
-  <w:num w:numId="8">
-    <w:abstractNumId w:val="5"/>
+  <w:num w:numId="14">
+    <w:abstractNumId w:val="15"/>
   </w:num>
-  <w:num w:numId="9">
-    <w:abstractNumId w:val="2"/>
-  </w:num>
-  <w:num w:numId="10">
-    <w:abstractNumId w:val="1"/>
-  </w:num>
-  <w:num w:numId="11">
-    <w:abstractNumId w:val="8"/>
-  </w:num>
-  <w:num w:numId="12">
+  <w:num w:numId="15">
     <w:abstractNumId w:val="4"/>
   </w:num>
-  <w:num w:numId="13">
-    <w:abstractNumId w:val="7"/>
-  </w:num>
-  <w:num w:numId="14">
-    <w:abstractNumId w:val="13"/>
+  <w:num w:numId="16">
+    <w:abstractNumId w:val="1"/>
   </w:num>
 </w:numbering>
 </file>
@@ -14522,7 +15341,7 @@
   <a:extraClrSchemeLst/>
   <a:extLst>
     <a:ext uri="{05A4C25C-085E-4340-85A3-A5531E510DB2}">
-      <thm15:themeFamily xmlns:thm15="http://schemas.microsoft.com/office/thememl/2012/main" xmlns="" name="Office Theme" id="{62F939B6-93AF-4DB8-9C6B-D6C7DFDC589F}" vid="{4A3C46E8-61CC-4603-A589-7422A47A8E4A}"/>
+      <thm15:themeFamily xmlns="" xmlns:thm15="http://schemas.microsoft.com/office/thememl/2012/main" name="Office Theme" id="{62F939B6-93AF-4DB8-9C6B-D6C7DFDC589F}" vid="{4A3C46E8-61CC-4603-A589-7422A47A8E4A}"/>
     </a:ext>
   </a:extLst>
 </a:theme>

</xml_diff>

<commit_message>
Updated UI and Export features
</commit_message>
<xml_diff>
--- a/Explanation.docx
+++ b/Explanation.docx
@@ -11745,535 +11745,16 @@
       </w:r>
     </w:p>
     <w:p>
-      <w:pPr>
+      <w:r>
         <w:rPr>
           <w:rFonts w:ascii="Arial" w:hAnsi="Arial" w:cs="Arial"/>
           <w:color w:val="E3E3E3"/>
           <w:sz w:val="20"/>
           <w:shd w:val="clear" w:color="auto" w:fill="1E1F20"/>
         </w:rPr>
-      </w:pPr>
-      <w:r>
-        <w:rPr>
-          <w:rFonts w:ascii="Arial" w:hAnsi="Arial" w:cs="Arial"/>
-          <w:color w:val="E3E3E3"/>
-          <w:sz w:val="20"/>
-          <w:shd w:val="clear" w:color="auto" w:fill="1E1F20"/>
-        </w:rPr>
         <w:t>The full coding with build command</w:t>
       </w:r>
     </w:p>
-    <w:p>
-      <w:pPr>
-        <w:rPr>
-          <w:rFonts w:ascii="Arial" w:hAnsi="Arial" w:cs="Arial"/>
-          <w:color w:val="E3E3E3"/>
-          <w:sz w:val="20"/>
-          <w:shd w:val="clear" w:color="auto" w:fill="1E1F20"/>
-        </w:rPr>
-      </w:pPr>
-    </w:p>
-    <w:p>
-      <w:pPr>
-        <w:pStyle w:val="NormalWeb"/>
-      </w:pPr>
-      <w:r>
-        <w:t xml:space="preserve">That is the "Mission Accomplished" message of the </w:t>
-      </w:r>
-      <w:proofErr w:type="spellStart"/>
-      <w:r>
-        <w:t>Git</w:t>
-      </w:r>
-      <w:proofErr w:type="spellEnd"/>
-      <w:r>
-        <w:t xml:space="preserve"> world!</w:t>
-      </w:r>
-    </w:p>
-    <w:p>
-      <w:pPr>
-        <w:pStyle w:val="NormalWeb"/>
-      </w:pPr>
-      <w:r>
-        <w:t xml:space="preserve">Your </w:t>
-      </w:r>
-      <w:r>
-        <w:rPr>
-          <w:b/>
-          <w:bCs/>
-        </w:rPr>
-        <w:t>Office Task Merger</w:t>
-      </w:r>
-      <w:r>
-        <w:t xml:space="preserve"> source code and </w:t>
-      </w:r>
-      <w:r>
-        <w:rPr>
-          <w:rStyle w:val="HTMLCode"/>
-        </w:rPr>
-        <w:t>requirements.txt</w:t>
-      </w:r>
-      <w:r>
-        <w:t xml:space="preserve"> are now safely stored in your </w:t>
-      </w:r>
-      <w:proofErr w:type="spellStart"/>
-      <w:r>
-        <w:t>GitHub</w:t>
-      </w:r>
-      <w:proofErr w:type="spellEnd"/>
-      <w:r>
-        <w:t xml:space="preserve"> repository at </w:t>
-      </w:r>
-      <w:r>
-        <w:rPr>
-          <w:rStyle w:val="HTMLCode"/>
-        </w:rPr>
-        <w:t>https://github.com/AkashVerma1986/Office-Task-Merger</w:t>
-      </w:r>
-      <w:r>
-        <w:t>.</w:t>
-      </w:r>
-    </w:p>
-    <w:p>
-      <w:pPr>
-        <w:pStyle w:val="Heading3"/>
-      </w:pPr>
-      <w:r>
-        <w:t>What this means for you:</w:t>
-      </w:r>
-    </w:p>
-    <w:p>
-      <w:pPr>
-        <w:pStyle w:val="NormalWeb"/>
-        <w:numPr>
-          <w:ilvl w:val="0"/>
-          <w:numId w:val="15"/>
-        </w:numPr>
-      </w:pPr>
-      <w:r>
-        <w:rPr>
-          <w:b/>
-          <w:bCs/>
-        </w:rPr>
-        <w:t>Backup:</w:t>
-      </w:r>
-      <w:r>
-        <w:t xml:space="preserve"> Your hard work on the </w:t>
-      </w:r>
-      <w:r>
-        <w:rPr>
-          <w:rStyle w:val="HTMLCode"/>
-        </w:rPr>
-        <w:t>task.py</w:t>
-      </w:r>
-      <w:r>
-        <w:t xml:space="preserve"> logic and your custom environment settings are backed up.</w:t>
-      </w:r>
-    </w:p>
-    <w:p>
-      <w:pPr>
-        <w:pStyle w:val="NormalWeb"/>
-        <w:numPr>
-          <w:ilvl w:val="0"/>
-          <w:numId w:val="15"/>
-        </w:numPr>
-      </w:pPr>
-      <w:r>
-        <w:rPr>
-          <w:b/>
-          <w:bCs/>
-        </w:rPr>
-        <w:t>Portability:</w:t>
-      </w:r>
-      <w:r>
-        <w:t xml:space="preserve"> If you move to another office computer, you just need to </w:t>
-      </w:r>
-      <w:proofErr w:type="spellStart"/>
-      <w:r>
-        <w:rPr>
-          <w:rStyle w:val="HTMLCode"/>
-        </w:rPr>
-        <w:t>git</w:t>
-      </w:r>
-      <w:proofErr w:type="spellEnd"/>
-      <w:r>
-        <w:rPr>
-          <w:rStyle w:val="HTMLCode"/>
-        </w:rPr>
-        <w:t xml:space="preserve"> clone</w:t>
-      </w:r>
-      <w:r>
-        <w:t xml:space="preserve"> this repository and run </w:t>
-      </w:r>
-      <w:r>
-        <w:rPr>
-          <w:rStyle w:val="HTMLCode"/>
-        </w:rPr>
-        <w:t>pip install -r requirements.txt</w:t>
-      </w:r>
-      <w:r>
-        <w:t xml:space="preserve"> to be back in business.</w:t>
-      </w:r>
-    </w:p>
-    <w:p>
-      <w:pPr>
-        <w:pStyle w:val="NormalWeb"/>
-        <w:numPr>
-          <w:ilvl w:val="0"/>
-          <w:numId w:val="15"/>
-        </w:numPr>
-      </w:pPr>
-      <w:r>
-        <w:rPr>
-          <w:b/>
-          <w:bCs/>
-        </w:rPr>
-        <w:t>Version Control:</w:t>
-      </w:r>
-      <w:r>
-        <w:t xml:space="preserve"> From now on, whenever you make a change to your code, you just need to run:</w:t>
-      </w:r>
-    </w:p>
-    <w:p>
-      <w:pPr>
-        <w:pStyle w:val="NormalWeb"/>
-        <w:numPr>
-          <w:ilvl w:val="1"/>
-          <w:numId w:val="15"/>
-        </w:numPr>
-      </w:pPr>
-      <w:proofErr w:type="spellStart"/>
-      <w:proofErr w:type="gramStart"/>
-      <w:r>
-        <w:rPr>
-          <w:rStyle w:val="HTMLCode"/>
-        </w:rPr>
-        <w:t>git</w:t>
-      </w:r>
-      <w:proofErr w:type="spellEnd"/>
-      <w:proofErr w:type="gramEnd"/>
-      <w:r>
-        <w:rPr>
-          <w:rStyle w:val="HTMLCode"/>
-        </w:rPr>
-        <w:t xml:space="preserve"> add .</w:t>
-      </w:r>
-    </w:p>
-    <w:p>
-      <w:pPr>
-        <w:pStyle w:val="NormalWeb"/>
-        <w:numPr>
-          <w:ilvl w:val="1"/>
-          <w:numId w:val="15"/>
-        </w:numPr>
-      </w:pPr>
-      <w:proofErr w:type="spellStart"/>
-      <w:r>
-        <w:rPr>
-          <w:rStyle w:val="HTMLCode"/>
-        </w:rPr>
-        <w:t>git</w:t>
-      </w:r>
-      <w:proofErr w:type="spellEnd"/>
-      <w:r>
-        <w:rPr>
-          <w:rStyle w:val="HTMLCode"/>
-        </w:rPr>
-        <w:t xml:space="preserve"> commit -m "Describe what I changed"</w:t>
-      </w:r>
-    </w:p>
-    <w:p>
-      <w:pPr>
-        <w:pStyle w:val="NormalWeb"/>
-        <w:numPr>
-          <w:ilvl w:val="1"/>
-          <w:numId w:val="15"/>
-        </w:numPr>
-      </w:pPr>
-      <w:proofErr w:type="spellStart"/>
-      <w:r>
-        <w:rPr>
-          <w:rStyle w:val="HTMLCode"/>
-        </w:rPr>
-        <w:t>git</w:t>
-      </w:r>
-      <w:proofErr w:type="spellEnd"/>
-      <w:r>
-        <w:rPr>
-          <w:rStyle w:val="HTMLCode"/>
-        </w:rPr>
-        <w:t xml:space="preserve"> push</w:t>
-      </w:r>
-    </w:p>
-    <w:p>
-      <w:pPr>
-        <w:pStyle w:val="Heading3"/>
-      </w:pPr>
-    </w:p>
-    <w:p>
-      <w:pPr>
-        <w:pStyle w:val="Heading3"/>
-      </w:pPr>
-    </w:p>
-    <w:p>
-      <w:pPr>
-        <w:pStyle w:val="Heading3"/>
-      </w:pPr>
-    </w:p>
-    <w:p>
-      <w:pPr>
-        <w:pStyle w:val="Heading3"/>
-      </w:pPr>
-    </w:p>
-    <w:p>
-      <w:pPr>
-        <w:pStyle w:val="Heading3"/>
-      </w:pPr>
-    </w:p>
-    <w:p>
-      <w:pPr>
-        <w:pStyle w:val="Heading3"/>
-      </w:pPr>
-    </w:p>
-    <w:p>
-      <w:pPr>
-        <w:pStyle w:val="Heading3"/>
-      </w:pPr>
-    </w:p>
-    <w:p>
-      <w:pPr>
-        <w:pStyle w:val="Heading3"/>
-      </w:pPr>
-    </w:p>
-    <w:p>
-      <w:pPr>
-        <w:pStyle w:val="Heading3"/>
-      </w:pPr>
-    </w:p>
-    <w:p>
-      <w:pPr>
-        <w:pStyle w:val="Heading3"/>
-      </w:pPr>
-    </w:p>
-    <w:p>
-      <w:pPr>
-        <w:pStyle w:val="Heading3"/>
-      </w:pPr>
-      <w:r>
-        <w:t>1. Adding the "Regular or Major" Dropdown</w:t>
-      </w:r>
-    </w:p>
-    <w:p>
-      <w:pPr>
-        <w:pStyle w:val="NormalWeb"/>
-      </w:pPr>
-      <w:r>
-        <w:t xml:space="preserve">To include this, we will modify the </w:t>
-      </w:r>
-      <w:r>
-        <w:rPr>
-          <w:rStyle w:val="HTMLCode"/>
-        </w:rPr>
-        <w:t>actions</w:t>
-      </w:r>
-      <w:r>
-        <w:t xml:space="preserve"> frame within the </w:t>
-      </w:r>
-      <w:proofErr w:type="spellStart"/>
-      <w:r>
-        <w:rPr>
-          <w:rStyle w:val="HTMLCode"/>
-        </w:rPr>
-        <w:t>refresh_ui</w:t>
-      </w:r>
-      <w:proofErr w:type="spellEnd"/>
-      <w:r>
-        <w:t xml:space="preserve"> method. Currently, you have a "Note" entry and a "Completed" button. We will insert a small </w:t>
-      </w:r>
-      <w:proofErr w:type="spellStart"/>
-      <w:r>
-        <w:rPr>
-          <w:rStyle w:val="HTMLCode"/>
-        </w:rPr>
-        <w:t>CTkComboBox</w:t>
-      </w:r>
-      <w:proofErr w:type="spellEnd"/>
-      <w:r>
-        <w:t xml:space="preserve"> between them.</w:t>
-      </w:r>
-    </w:p>
-    <w:p>
-      <w:pPr>
-        <w:pStyle w:val="NormalWeb"/>
-      </w:pPr>
-      <w:r>
-        <w:rPr>
-          <w:b/>
-          <w:bCs/>
-        </w:rPr>
-        <w:t>The Logic:</w:t>
-      </w:r>
-    </w:p>
-    <w:p>
-      <w:pPr>
-        <w:pStyle w:val="NormalWeb"/>
-        <w:numPr>
-          <w:ilvl w:val="0"/>
-          <w:numId w:val="16"/>
-        </w:numPr>
-      </w:pPr>
-      <w:r>
-        <w:t xml:space="preserve">A new </w:t>
-      </w:r>
-      <w:proofErr w:type="spellStart"/>
-      <w:r>
-        <w:rPr>
-          <w:rStyle w:val="HTMLCode"/>
-        </w:rPr>
-        <w:t>self.completion_types</w:t>
-      </w:r>
-      <w:proofErr w:type="spellEnd"/>
-      <w:r>
-        <w:t xml:space="preserve"> dictionary will store the value of this dropdown for each task.</w:t>
-      </w:r>
-    </w:p>
-    <w:p>
-      <w:pPr>
-        <w:pStyle w:val="NormalWeb"/>
-        <w:numPr>
-          <w:ilvl w:val="0"/>
-          <w:numId w:val="16"/>
-        </w:numPr>
-      </w:pPr>
-      <w:r>
-        <w:t>When "Completed" is clicked, the selected value (Regular/Major) will be sent to Firebase along with your note.</w:t>
-      </w:r>
-    </w:p>
-    <w:p>
-      <w:pPr>
-        <w:pStyle w:val="Heading3"/>
-      </w:pPr>
-      <w:r>
-        <w:t>2. Fixing the Time Display</w:t>
-      </w:r>
-    </w:p>
-    <w:p>
-      <w:pPr>
-        <w:pStyle w:val="NormalWeb"/>
-      </w:pPr>
-      <w:r>
-        <w:t xml:space="preserve">If the time is showing incorrectly (e.g., wrong </w:t>
-      </w:r>
-      <w:proofErr w:type="spellStart"/>
-      <w:r>
-        <w:t>timezone</w:t>
-      </w:r>
-      <w:proofErr w:type="spellEnd"/>
-      <w:r>
-        <w:t xml:space="preserve"> or static time), it is likely because </w:t>
-      </w:r>
-      <w:proofErr w:type="spellStart"/>
-      <w:proofErr w:type="gramStart"/>
-      <w:r>
-        <w:rPr>
-          <w:rStyle w:val="HTMLCode"/>
-        </w:rPr>
-        <w:t>datetime.now</w:t>
-      </w:r>
-      <w:proofErr w:type="spellEnd"/>
-      <w:r>
-        <w:rPr>
-          <w:rStyle w:val="HTMLCode"/>
-        </w:rPr>
-        <w:t>(</w:t>
-      </w:r>
-      <w:proofErr w:type="gramEnd"/>
-      <w:r>
-        <w:rPr>
-          <w:rStyle w:val="HTMLCode"/>
-        </w:rPr>
-        <w:t>)</w:t>
-      </w:r>
-      <w:r>
-        <w:t xml:space="preserve"> needs to be called at the exact moment of the click, and the formatting string must match between the "Add" and "Display" functions.</w:t>
-      </w:r>
-    </w:p>
-    <w:p/>
-    <w:p/>
-    <w:p/>
-    <w:p>
-      <w:pPr>
-        <w:pStyle w:val="NormalWeb"/>
-      </w:pPr>
-    </w:p>
-    <w:p>
-      <w:pPr>
-        <w:pStyle w:val="NormalWeb"/>
-      </w:pPr>
-    </w:p>
-    <w:p>
-      <w:pPr>
-        <w:pStyle w:val="NormalWeb"/>
-      </w:pPr>
-    </w:p>
-    <w:p>
-      <w:pPr>
-        <w:pStyle w:val="NormalWeb"/>
-      </w:pPr>
-    </w:p>
-    <w:p>
-      <w:pPr>
-        <w:pStyle w:val="NormalWeb"/>
-      </w:pPr>
-      <w:r>
-        <w:lastRenderedPageBreak/>
-        <w:t xml:space="preserve">Adding an edit feature to a live-syncing Firebase application </w:t>
-      </w:r>
-      <w:proofErr w:type="gramStart"/>
-      <w:r>
-        <w:t>requires a "</w:t>
-      </w:r>
-      <w:proofErr w:type="gramEnd"/>
-      <w:r>
-        <w:t>Switch" logic: we need to turn the static task labels into editable input fields temporarily, then "Save" those changes back to the database.</w:t>
-      </w:r>
-    </w:p>
-    <w:p>
-      <w:pPr>
-        <w:pStyle w:val="NormalWeb"/>
-      </w:pPr>
-      <w:r>
-        <w:t xml:space="preserve">I have updated the code to include an </w:t>
-      </w:r>
-      <w:r>
-        <w:rPr>
-          <w:b/>
-          <w:bCs/>
-        </w:rPr>
-        <w:t>"Edit" button</w:t>
-      </w:r>
-      <w:r>
-        <w:t xml:space="preserve"> (represented by a </w:t>
-      </w:r>
-      <w:r>
-        <w:rPr>
-          <w:rStyle w:val="HTMLCode"/>
-          <w:rFonts w:ascii="MS Mincho" w:eastAsia="MS Mincho" w:hAnsi="MS Mincho" w:cs="MS Mincho" w:hint="eastAsia"/>
-        </w:rPr>
-        <w:t>✎</w:t>
-      </w:r>
-      <w:r>
-        <w:t xml:space="preserve"> icon). When clicked, it opens a simple dialog allowing you to fix the Finance name or the Task description.</w:t>
-      </w:r>
-    </w:p>
-    <w:p>
-      <w:pPr>
-        <w:pStyle w:val="Heading3"/>
-      </w:pPr>
-      <w:r>
-        <w:t>Updated Full Code (v2.1)</w:t>
-      </w:r>
-    </w:p>
-    <w:p/>
     <w:sectPr>
       <w:pgSz w:w="11906" w:h="16838"/>
       <w:pgMar w:top="1440" w:right="1440" w:bottom="1440" w:left="1440" w:header="708" w:footer="708" w:gutter="0"/>
@@ -12436,9 +11917,9 @@
     </w:lvl>
   </w:abstractNum>
   <w:abstractNum w:abstractNumId="1">
-    <w:nsid w:val="2C056ECF"/>
+    <w:nsid w:val="2CC006E1"/>
     <w:multiLevelType w:val="multilevel"/>
-    <w:tmpl w:val="895AE318"/>
+    <w:tmpl w:val="220469BA"/>
     <w:lvl w:ilvl="0">
       <w:start w:val="1"/>
       <w:numFmt w:val="bullet"/>
@@ -12585,9 +12066,9 @@
     </w:lvl>
   </w:abstractNum>
   <w:abstractNum w:abstractNumId="2">
-    <w:nsid w:val="2CC006E1"/>
+    <w:nsid w:val="2D5558F5"/>
     <w:multiLevelType w:val="multilevel"/>
-    <w:tmpl w:val="220469BA"/>
+    <w:tmpl w:val="089CAC44"/>
     <w:lvl w:ilvl="0">
       <w:start w:val="1"/>
       <w:numFmt w:val="bullet"/>
@@ -12734,9 +12215,122 @@
     </w:lvl>
   </w:abstractNum>
   <w:abstractNum w:abstractNumId="3">
-    <w:nsid w:val="2D5558F5"/>
+    <w:nsid w:val="33835B5B"/>
     <w:multiLevelType w:val="multilevel"/>
-    <w:tmpl w:val="089CAC44"/>
+    <w:tmpl w:val="0DEA12BA"/>
+    <w:lvl w:ilvl="0">
+      <w:start w:val="1"/>
+      <w:numFmt w:val="decimal"/>
+      <w:lvlText w:val="%1."/>
+      <w:lvlJc w:val="left"/>
+      <w:pPr>
+        <w:tabs>
+          <w:tab w:val="num" w:pos="720"/>
+        </w:tabs>
+        <w:ind w:left="720" w:hanging="360"/>
+      </w:pPr>
+    </w:lvl>
+    <w:lvl w:ilvl="1" w:tentative="1">
+      <w:start w:val="1"/>
+      <w:numFmt w:val="decimal"/>
+      <w:lvlText w:val="%2."/>
+      <w:lvlJc w:val="left"/>
+      <w:pPr>
+        <w:tabs>
+          <w:tab w:val="num" w:pos="1440"/>
+        </w:tabs>
+        <w:ind w:left="1440" w:hanging="360"/>
+      </w:pPr>
+    </w:lvl>
+    <w:lvl w:ilvl="2" w:tentative="1">
+      <w:start w:val="1"/>
+      <w:numFmt w:val="decimal"/>
+      <w:lvlText w:val="%3."/>
+      <w:lvlJc w:val="left"/>
+      <w:pPr>
+        <w:tabs>
+          <w:tab w:val="num" w:pos="2160"/>
+        </w:tabs>
+        <w:ind w:left="2160" w:hanging="360"/>
+      </w:pPr>
+    </w:lvl>
+    <w:lvl w:ilvl="3" w:tentative="1">
+      <w:start w:val="1"/>
+      <w:numFmt w:val="decimal"/>
+      <w:lvlText w:val="%4."/>
+      <w:lvlJc w:val="left"/>
+      <w:pPr>
+        <w:tabs>
+          <w:tab w:val="num" w:pos="2880"/>
+        </w:tabs>
+        <w:ind w:left="2880" w:hanging="360"/>
+      </w:pPr>
+    </w:lvl>
+    <w:lvl w:ilvl="4" w:tentative="1">
+      <w:start w:val="1"/>
+      <w:numFmt w:val="decimal"/>
+      <w:lvlText w:val="%5."/>
+      <w:lvlJc w:val="left"/>
+      <w:pPr>
+        <w:tabs>
+          <w:tab w:val="num" w:pos="3600"/>
+        </w:tabs>
+        <w:ind w:left="3600" w:hanging="360"/>
+      </w:pPr>
+    </w:lvl>
+    <w:lvl w:ilvl="5" w:tentative="1">
+      <w:start w:val="1"/>
+      <w:numFmt w:val="decimal"/>
+      <w:lvlText w:val="%6."/>
+      <w:lvlJc w:val="left"/>
+      <w:pPr>
+        <w:tabs>
+          <w:tab w:val="num" w:pos="4320"/>
+        </w:tabs>
+        <w:ind w:left="4320" w:hanging="360"/>
+      </w:pPr>
+    </w:lvl>
+    <w:lvl w:ilvl="6" w:tentative="1">
+      <w:start w:val="1"/>
+      <w:numFmt w:val="decimal"/>
+      <w:lvlText w:val="%7."/>
+      <w:lvlJc w:val="left"/>
+      <w:pPr>
+        <w:tabs>
+          <w:tab w:val="num" w:pos="5040"/>
+        </w:tabs>
+        <w:ind w:left="5040" w:hanging="360"/>
+      </w:pPr>
+    </w:lvl>
+    <w:lvl w:ilvl="7" w:tentative="1">
+      <w:start w:val="1"/>
+      <w:numFmt w:val="decimal"/>
+      <w:lvlText w:val="%8."/>
+      <w:lvlJc w:val="left"/>
+      <w:pPr>
+        <w:tabs>
+          <w:tab w:val="num" w:pos="5760"/>
+        </w:tabs>
+        <w:ind w:left="5760" w:hanging="360"/>
+      </w:pPr>
+    </w:lvl>
+    <w:lvl w:ilvl="8" w:tentative="1">
+      <w:start w:val="1"/>
+      <w:numFmt w:val="decimal"/>
+      <w:lvlText w:val="%9."/>
+      <w:lvlJc w:val="left"/>
+      <w:pPr>
+        <w:tabs>
+          <w:tab w:val="num" w:pos="6480"/>
+        </w:tabs>
+        <w:ind w:left="6480" w:hanging="360"/>
+      </w:pPr>
+    </w:lvl>
+  </w:abstractNum>
+  <w:abstractNum w:abstractNumId="4">
+    <w:nsid w:val="3B167A9F"/>
+    <w:multiLevelType w:val="multilevel"/>
+    <w:tmpl w:val="FF3C6BE0"/>
     <w:lvl w:ilvl="0">
       <w:start w:val="1"/>
       <w:numFmt w:val="bullet"/>
@@ -12882,10 +12476,10 @@
       </w:rPr>
     </w:lvl>
   </w:abstractNum>
-  <w:abstractNum w:abstractNumId="4">
-    <w:nsid w:val="331D24DD"/>
+  <w:abstractNum w:abstractNumId="5">
+    <w:nsid w:val="4BE67943"/>
     <w:multiLevelType w:val="multilevel"/>
-    <w:tmpl w:val="D1E28194"/>
+    <w:tmpl w:val="849CBBAE"/>
     <w:lvl w:ilvl="0">
       <w:start w:val="1"/>
       <w:numFmt w:val="bullet"/>
@@ -12902,10 +12496,10 @@
         <w:sz w:val="20"/>
       </w:rPr>
     </w:lvl>
-    <w:lvl w:ilvl="1">
+    <w:lvl w:ilvl="1" w:tentative="1">
       <w:start w:val="1"/>
-      <w:numFmt w:val="decimal"/>
-      <w:lvlText w:val="%2."/>
+      <w:numFmt w:val="bullet"/>
+      <w:lvlText w:val="o"/>
       <w:lvlJc w:val="left"/>
       <w:pPr>
         <w:tabs>
@@ -12913,6 +12507,10 @@
         </w:tabs>
         <w:ind w:left="1440" w:hanging="360"/>
       </w:pPr>
+      <w:rPr>
+        <w:rFonts w:ascii="Courier New" w:hAnsi="Courier New" w:hint="default"/>
+        <w:sz w:val="20"/>
+      </w:rPr>
     </w:lvl>
     <w:lvl w:ilvl="2" w:tentative="1">
       <w:start w:val="1"/>
@@ -13027,123 +12625,10 @@
       </w:rPr>
     </w:lvl>
   </w:abstractNum>
-  <w:abstractNum w:abstractNumId="5">
-    <w:nsid w:val="33835B5B"/>
+  <w:abstractNum w:abstractNumId="6">
+    <w:nsid w:val="4D1729E4"/>
     <w:multiLevelType w:val="multilevel"/>
-    <w:tmpl w:val="0DEA12BA"/>
-    <w:lvl w:ilvl="0">
-      <w:start w:val="1"/>
-      <w:numFmt w:val="decimal"/>
-      <w:lvlText w:val="%1."/>
-      <w:lvlJc w:val="left"/>
-      <w:pPr>
-        <w:tabs>
-          <w:tab w:val="num" w:pos="720"/>
-        </w:tabs>
-        <w:ind w:left="720" w:hanging="360"/>
-      </w:pPr>
-    </w:lvl>
-    <w:lvl w:ilvl="1" w:tentative="1">
-      <w:start w:val="1"/>
-      <w:numFmt w:val="decimal"/>
-      <w:lvlText w:val="%2."/>
-      <w:lvlJc w:val="left"/>
-      <w:pPr>
-        <w:tabs>
-          <w:tab w:val="num" w:pos="1440"/>
-        </w:tabs>
-        <w:ind w:left="1440" w:hanging="360"/>
-      </w:pPr>
-    </w:lvl>
-    <w:lvl w:ilvl="2" w:tentative="1">
-      <w:start w:val="1"/>
-      <w:numFmt w:val="decimal"/>
-      <w:lvlText w:val="%3."/>
-      <w:lvlJc w:val="left"/>
-      <w:pPr>
-        <w:tabs>
-          <w:tab w:val="num" w:pos="2160"/>
-        </w:tabs>
-        <w:ind w:left="2160" w:hanging="360"/>
-      </w:pPr>
-    </w:lvl>
-    <w:lvl w:ilvl="3" w:tentative="1">
-      <w:start w:val="1"/>
-      <w:numFmt w:val="decimal"/>
-      <w:lvlText w:val="%4."/>
-      <w:lvlJc w:val="left"/>
-      <w:pPr>
-        <w:tabs>
-          <w:tab w:val="num" w:pos="2880"/>
-        </w:tabs>
-        <w:ind w:left="2880" w:hanging="360"/>
-      </w:pPr>
-    </w:lvl>
-    <w:lvl w:ilvl="4" w:tentative="1">
-      <w:start w:val="1"/>
-      <w:numFmt w:val="decimal"/>
-      <w:lvlText w:val="%5."/>
-      <w:lvlJc w:val="left"/>
-      <w:pPr>
-        <w:tabs>
-          <w:tab w:val="num" w:pos="3600"/>
-        </w:tabs>
-        <w:ind w:left="3600" w:hanging="360"/>
-      </w:pPr>
-    </w:lvl>
-    <w:lvl w:ilvl="5" w:tentative="1">
-      <w:start w:val="1"/>
-      <w:numFmt w:val="decimal"/>
-      <w:lvlText w:val="%6."/>
-      <w:lvlJc w:val="left"/>
-      <w:pPr>
-        <w:tabs>
-          <w:tab w:val="num" w:pos="4320"/>
-        </w:tabs>
-        <w:ind w:left="4320" w:hanging="360"/>
-      </w:pPr>
-    </w:lvl>
-    <w:lvl w:ilvl="6" w:tentative="1">
-      <w:start w:val="1"/>
-      <w:numFmt w:val="decimal"/>
-      <w:lvlText w:val="%7."/>
-      <w:lvlJc w:val="left"/>
-      <w:pPr>
-        <w:tabs>
-          <w:tab w:val="num" w:pos="5040"/>
-        </w:tabs>
-        <w:ind w:left="5040" w:hanging="360"/>
-      </w:pPr>
-    </w:lvl>
-    <w:lvl w:ilvl="7" w:tentative="1">
-      <w:start w:val="1"/>
-      <w:numFmt w:val="decimal"/>
-      <w:lvlText w:val="%8."/>
-      <w:lvlJc w:val="left"/>
-      <w:pPr>
-        <w:tabs>
-          <w:tab w:val="num" w:pos="5760"/>
-        </w:tabs>
-        <w:ind w:left="5760" w:hanging="360"/>
-      </w:pPr>
-    </w:lvl>
-    <w:lvl w:ilvl="8" w:tentative="1">
-      <w:start w:val="1"/>
-      <w:numFmt w:val="decimal"/>
-      <w:lvlText w:val="%9."/>
-      <w:lvlJc w:val="left"/>
-      <w:pPr>
-        <w:tabs>
-          <w:tab w:val="num" w:pos="6480"/>
-        </w:tabs>
-        <w:ind w:left="6480" w:hanging="360"/>
-      </w:pPr>
-    </w:lvl>
-  </w:abstractNum>
-  <w:abstractNum w:abstractNumId="6">
-    <w:nsid w:val="3B167A9F"/>
-    <w:multiLevelType w:val="multilevel"/>
-    <w:tmpl w:val="FF3C6BE0"/>
+    <w:tmpl w:val="7D86028E"/>
     <w:lvl w:ilvl="0">
       <w:start w:val="1"/>
       <w:numFmt w:val="bullet"/>
@@ -13290,9 +12775,9 @@
     </w:lvl>
   </w:abstractNum>
   <w:abstractNum w:abstractNumId="7">
-    <w:nsid w:val="4BE67943"/>
+    <w:nsid w:val="4DE504D0"/>
     <w:multiLevelType w:val="multilevel"/>
-    <w:tmpl w:val="849CBBAE"/>
+    <w:tmpl w:val="AF328F58"/>
     <w:lvl w:ilvl="0">
       <w:start w:val="1"/>
       <w:numFmt w:val="bullet"/>
@@ -13439,9 +12924,9 @@
     </w:lvl>
   </w:abstractNum>
   <w:abstractNum w:abstractNumId="8">
-    <w:nsid w:val="4D1729E4"/>
+    <w:nsid w:val="509B0FC5"/>
     <w:multiLevelType w:val="multilevel"/>
-    <w:tmpl w:val="7D86028E"/>
+    <w:tmpl w:val="3BA816F8"/>
     <w:lvl w:ilvl="0">
       <w:start w:val="1"/>
       <w:numFmt w:val="bullet"/>
@@ -13588,9 +13073,275 @@
     </w:lvl>
   </w:abstractNum>
   <w:abstractNum w:abstractNumId="9">
-    <w:nsid w:val="4DE504D0"/>
+    <w:nsid w:val="5DF30A33"/>
     <w:multiLevelType w:val="multilevel"/>
-    <w:tmpl w:val="AF328F58"/>
+    <w:tmpl w:val="F5F8CBCA"/>
+    <w:lvl w:ilvl="0">
+      <w:start w:val="1"/>
+      <w:numFmt w:val="decimal"/>
+      <w:lvlText w:val="%1."/>
+      <w:lvlJc w:val="left"/>
+      <w:pPr>
+        <w:tabs>
+          <w:tab w:val="num" w:pos="720"/>
+        </w:tabs>
+        <w:ind w:left="720" w:hanging="360"/>
+      </w:pPr>
+    </w:lvl>
+    <w:lvl w:ilvl="1">
+      <w:start w:val="1"/>
+      <w:numFmt w:val="bullet"/>
+      <w:lvlText w:val="o"/>
+      <w:lvlJc w:val="left"/>
+      <w:pPr>
+        <w:tabs>
+          <w:tab w:val="num" w:pos="1440"/>
+        </w:tabs>
+        <w:ind w:left="1440" w:hanging="360"/>
+      </w:pPr>
+      <w:rPr>
+        <w:rFonts w:ascii="Courier New" w:hAnsi="Courier New" w:hint="default"/>
+        <w:sz w:val="20"/>
+      </w:rPr>
+    </w:lvl>
+    <w:lvl w:ilvl="2" w:tentative="1">
+      <w:start w:val="1"/>
+      <w:numFmt w:val="decimal"/>
+      <w:lvlText w:val="%3."/>
+      <w:lvlJc w:val="left"/>
+      <w:pPr>
+        <w:tabs>
+          <w:tab w:val="num" w:pos="2160"/>
+        </w:tabs>
+        <w:ind w:left="2160" w:hanging="360"/>
+      </w:pPr>
+    </w:lvl>
+    <w:lvl w:ilvl="3" w:tentative="1">
+      <w:start w:val="1"/>
+      <w:numFmt w:val="decimal"/>
+      <w:lvlText w:val="%4."/>
+      <w:lvlJc w:val="left"/>
+      <w:pPr>
+        <w:tabs>
+          <w:tab w:val="num" w:pos="2880"/>
+        </w:tabs>
+        <w:ind w:left="2880" w:hanging="360"/>
+      </w:pPr>
+    </w:lvl>
+    <w:lvl w:ilvl="4" w:tentative="1">
+      <w:start w:val="1"/>
+      <w:numFmt w:val="decimal"/>
+      <w:lvlText w:val="%5."/>
+      <w:lvlJc w:val="left"/>
+      <w:pPr>
+        <w:tabs>
+          <w:tab w:val="num" w:pos="3600"/>
+        </w:tabs>
+        <w:ind w:left="3600" w:hanging="360"/>
+      </w:pPr>
+    </w:lvl>
+    <w:lvl w:ilvl="5" w:tentative="1">
+      <w:start w:val="1"/>
+      <w:numFmt w:val="decimal"/>
+      <w:lvlText w:val="%6."/>
+      <w:lvlJc w:val="left"/>
+      <w:pPr>
+        <w:tabs>
+          <w:tab w:val="num" w:pos="4320"/>
+        </w:tabs>
+        <w:ind w:left="4320" w:hanging="360"/>
+      </w:pPr>
+    </w:lvl>
+    <w:lvl w:ilvl="6" w:tentative="1">
+      <w:start w:val="1"/>
+      <w:numFmt w:val="decimal"/>
+      <w:lvlText w:val="%7."/>
+      <w:lvlJc w:val="left"/>
+      <w:pPr>
+        <w:tabs>
+          <w:tab w:val="num" w:pos="5040"/>
+        </w:tabs>
+        <w:ind w:left="5040" w:hanging="360"/>
+      </w:pPr>
+    </w:lvl>
+    <w:lvl w:ilvl="7" w:tentative="1">
+      <w:start w:val="1"/>
+      <w:numFmt w:val="decimal"/>
+      <w:lvlText w:val="%8."/>
+      <w:lvlJc w:val="left"/>
+      <w:pPr>
+        <w:tabs>
+          <w:tab w:val="num" w:pos="5760"/>
+        </w:tabs>
+        <w:ind w:left="5760" w:hanging="360"/>
+      </w:pPr>
+    </w:lvl>
+    <w:lvl w:ilvl="8" w:tentative="1">
+      <w:start w:val="1"/>
+      <w:numFmt w:val="decimal"/>
+      <w:lvlText w:val="%9."/>
+      <w:lvlJc w:val="left"/>
+      <w:pPr>
+        <w:tabs>
+          <w:tab w:val="num" w:pos="6480"/>
+        </w:tabs>
+        <w:ind w:left="6480" w:hanging="360"/>
+      </w:pPr>
+    </w:lvl>
+  </w:abstractNum>
+  <w:abstractNum w:abstractNumId="10">
+    <w:nsid w:val="64EC0092"/>
+    <w:multiLevelType w:val="multilevel"/>
+    <w:tmpl w:val="D88E7B7E"/>
+    <w:lvl w:ilvl="0">
+      <w:start w:val="1"/>
+      <w:numFmt w:val="bullet"/>
+      <w:lvlText w:val=""/>
+      <w:lvlJc w:val="left"/>
+      <w:pPr>
+        <w:tabs>
+          <w:tab w:val="num" w:pos="720"/>
+        </w:tabs>
+        <w:ind w:left="720" w:hanging="360"/>
+      </w:pPr>
+      <w:rPr>
+        <w:rFonts w:ascii="Symbol" w:hAnsi="Symbol" w:hint="default"/>
+        <w:sz w:val="20"/>
+      </w:rPr>
+    </w:lvl>
+    <w:lvl w:ilvl="1">
+      <w:start w:val="1"/>
+      <w:numFmt w:val="bullet"/>
+      <w:lvlText w:val="o"/>
+      <w:lvlJc w:val="left"/>
+      <w:pPr>
+        <w:tabs>
+          <w:tab w:val="num" w:pos="1440"/>
+        </w:tabs>
+        <w:ind w:left="1440" w:hanging="360"/>
+      </w:pPr>
+      <w:rPr>
+        <w:rFonts w:ascii="Courier New" w:hAnsi="Courier New" w:hint="default"/>
+        <w:sz w:val="20"/>
+      </w:rPr>
+    </w:lvl>
+    <w:lvl w:ilvl="2" w:tentative="1">
+      <w:start w:val="1"/>
+      <w:numFmt w:val="bullet"/>
+      <w:lvlText w:val=""/>
+      <w:lvlJc w:val="left"/>
+      <w:pPr>
+        <w:tabs>
+          <w:tab w:val="num" w:pos="2160"/>
+        </w:tabs>
+        <w:ind w:left="2160" w:hanging="360"/>
+      </w:pPr>
+      <w:rPr>
+        <w:rFonts w:ascii="Wingdings" w:hAnsi="Wingdings" w:hint="default"/>
+        <w:sz w:val="20"/>
+      </w:rPr>
+    </w:lvl>
+    <w:lvl w:ilvl="3" w:tentative="1">
+      <w:start w:val="1"/>
+      <w:numFmt w:val="bullet"/>
+      <w:lvlText w:val=""/>
+      <w:lvlJc w:val="left"/>
+      <w:pPr>
+        <w:tabs>
+          <w:tab w:val="num" w:pos="2880"/>
+        </w:tabs>
+        <w:ind w:left="2880" w:hanging="360"/>
+      </w:pPr>
+      <w:rPr>
+        <w:rFonts w:ascii="Wingdings" w:hAnsi="Wingdings" w:hint="default"/>
+        <w:sz w:val="20"/>
+      </w:rPr>
+    </w:lvl>
+    <w:lvl w:ilvl="4" w:tentative="1">
+      <w:start w:val="1"/>
+      <w:numFmt w:val="bullet"/>
+      <w:lvlText w:val=""/>
+      <w:lvlJc w:val="left"/>
+      <w:pPr>
+        <w:tabs>
+          <w:tab w:val="num" w:pos="3600"/>
+        </w:tabs>
+        <w:ind w:left="3600" w:hanging="360"/>
+      </w:pPr>
+      <w:rPr>
+        <w:rFonts w:ascii="Wingdings" w:hAnsi="Wingdings" w:hint="default"/>
+        <w:sz w:val="20"/>
+      </w:rPr>
+    </w:lvl>
+    <w:lvl w:ilvl="5" w:tentative="1">
+      <w:start w:val="1"/>
+      <w:numFmt w:val="bullet"/>
+      <w:lvlText w:val=""/>
+      <w:lvlJc w:val="left"/>
+      <w:pPr>
+        <w:tabs>
+          <w:tab w:val="num" w:pos="4320"/>
+        </w:tabs>
+        <w:ind w:left="4320" w:hanging="360"/>
+      </w:pPr>
+      <w:rPr>
+        <w:rFonts w:ascii="Wingdings" w:hAnsi="Wingdings" w:hint="default"/>
+        <w:sz w:val="20"/>
+      </w:rPr>
+    </w:lvl>
+    <w:lvl w:ilvl="6" w:tentative="1">
+      <w:start w:val="1"/>
+      <w:numFmt w:val="bullet"/>
+      <w:lvlText w:val=""/>
+      <w:lvlJc w:val="left"/>
+      <w:pPr>
+        <w:tabs>
+          <w:tab w:val="num" w:pos="5040"/>
+        </w:tabs>
+        <w:ind w:left="5040" w:hanging="360"/>
+      </w:pPr>
+      <w:rPr>
+        <w:rFonts w:ascii="Wingdings" w:hAnsi="Wingdings" w:hint="default"/>
+        <w:sz w:val="20"/>
+      </w:rPr>
+    </w:lvl>
+    <w:lvl w:ilvl="7" w:tentative="1">
+      <w:start w:val="1"/>
+      <w:numFmt w:val="bullet"/>
+      <w:lvlText w:val=""/>
+      <w:lvlJc w:val="left"/>
+      <w:pPr>
+        <w:tabs>
+          <w:tab w:val="num" w:pos="5760"/>
+        </w:tabs>
+        <w:ind w:left="5760" w:hanging="360"/>
+      </w:pPr>
+      <w:rPr>
+        <w:rFonts w:ascii="Wingdings" w:hAnsi="Wingdings" w:hint="default"/>
+        <w:sz w:val="20"/>
+      </w:rPr>
+    </w:lvl>
+    <w:lvl w:ilvl="8" w:tentative="1">
+      <w:start w:val="1"/>
+      <w:numFmt w:val="bullet"/>
+      <w:lvlText w:val=""/>
+      <w:lvlJc w:val="left"/>
+      <w:pPr>
+        <w:tabs>
+          <w:tab w:val="num" w:pos="6480"/>
+        </w:tabs>
+        <w:ind w:left="6480" w:hanging="360"/>
+      </w:pPr>
+      <w:rPr>
+        <w:rFonts w:ascii="Wingdings" w:hAnsi="Wingdings" w:hint="default"/>
+        <w:sz w:val="20"/>
+      </w:rPr>
+    </w:lvl>
+  </w:abstractNum>
+  <w:abstractNum w:abstractNumId="11">
+    <w:nsid w:val="6A4809B5"/>
+    <w:multiLevelType w:val="multilevel"/>
+    <w:tmpl w:val="1E1C82E8"/>
     <w:lvl w:ilvl="0">
       <w:start w:val="1"/>
       <w:numFmt w:val="bullet"/>
@@ -13736,10 +13487,10 @@
       </w:rPr>
     </w:lvl>
   </w:abstractNum>
-  <w:abstractNum w:abstractNumId="10">
-    <w:nsid w:val="509B0FC5"/>
+  <w:abstractNum w:abstractNumId="12">
+    <w:nsid w:val="79BB5B10"/>
     <w:multiLevelType w:val="multilevel"/>
-    <w:tmpl w:val="3BA816F8"/>
+    <w:tmpl w:val="7F984CDE"/>
     <w:lvl w:ilvl="0">
       <w:start w:val="1"/>
       <w:numFmt w:val="bullet"/>
@@ -13885,127 +13636,10 @@
       </w:rPr>
     </w:lvl>
   </w:abstractNum>
-  <w:abstractNum w:abstractNumId="11">
-    <w:nsid w:val="5DF30A33"/>
+  <w:abstractNum w:abstractNumId="13">
+    <w:nsid w:val="7D101A7E"/>
     <w:multiLevelType w:val="multilevel"/>
-    <w:tmpl w:val="F5F8CBCA"/>
-    <w:lvl w:ilvl="0">
-      <w:start w:val="1"/>
-      <w:numFmt w:val="decimal"/>
-      <w:lvlText w:val="%1."/>
-      <w:lvlJc w:val="left"/>
-      <w:pPr>
-        <w:tabs>
-          <w:tab w:val="num" w:pos="720"/>
-        </w:tabs>
-        <w:ind w:left="720" w:hanging="360"/>
-      </w:pPr>
-    </w:lvl>
-    <w:lvl w:ilvl="1">
-      <w:start w:val="1"/>
-      <w:numFmt w:val="bullet"/>
-      <w:lvlText w:val="o"/>
-      <w:lvlJc w:val="left"/>
-      <w:pPr>
-        <w:tabs>
-          <w:tab w:val="num" w:pos="1440"/>
-        </w:tabs>
-        <w:ind w:left="1440" w:hanging="360"/>
-      </w:pPr>
-      <w:rPr>
-        <w:rFonts w:ascii="Courier New" w:hAnsi="Courier New" w:hint="default"/>
-        <w:sz w:val="20"/>
-      </w:rPr>
-    </w:lvl>
-    <w:lvl w:ilvl="2" w:tentative="1">
-      <w:start w:val="1"/>
-      <w:numFmt w:val="decimal"/>
-      <w:lvlText w:val="%3."/>
-      <w:lvlJc w:val="left"/>
-      <w:pPr>
-        <w:tabs>
-          <w:tab w:val="num" w:pos="2160"/>
-        </w:tabs>
-        <w:ind w:left="2160" w:hanging="360"/>
-      </w:pPr>
-    </w:lvl>
-    <w:lvl w:ilvl="3" w:tentative="1">
-      <w:start w:val="1"/>
-      <w:numFmt w:val="decimal"/>
-      <w:lvlText w:val="%4."/>
-      <w:lvlJc w:val="left"/>
-      <w:pPr>
-        <w:tabs>
-          <w:tab w:val="num" w:pos="2880"/>
-        </w:tabs>
-        <w:ind w:left="2880" w:hanging="360"/>
-      </w:pPr>
-    </w:lvl>
-    <w:lvl w:ilvl="4" w:tentative="1">
-      <w:start w:val="1"/>
-      <w:numFmt w:val="decimal"/>
-      <w:lvlText w:val="%5."/>
-      <w:lvlJc w:val="left"/>
-      <w:pPr>
-        <w:tabs>
-          <w:tab w:val="num" w:pos="3600"/>
-        </w:tabs>
-        <w:ind w:left="3600" w:hanging="360"/>
-      </w:pPr>
-    </w:lvl>
-    <w:lvl w:ilvl="5" w:tentative="1">
-      <w:start w:val="1"/>
-      <w:numFmt w:val="decimal"/>
-      <w:lvlText w:val="%6."/>
-      <w:lvlJc w:val="left"/>
-      <w:pPr>
-        <w:tabs>
-          <w:tab w:val="num" w:pos="4320"/>
-        </w:tabs>
-        <w:ind w:left="4320" w:hanging="360"/>
-      </w:pPr>
-    </w:lvl>
-    <w:lvl w:ilvl="6" w:tentative="1">
-      <w:start w:val="1"/>
-      <w:numFmt w:val="decimal"/>
-      <w:lvlText w:val="%7."/>
-      <w:lvlJc w:val="left"/>
-      <w:pPr>
-        <w:tabs>
-          <w:tab w:val="num" w:pos="5040"/>
-        </w:tabs>
-        <w:ind w:left="5040" w:hanging="360"/>
-      </w:pPr>
-    </w:lvl>
-    <w:lvl w:ilvl="7" w:tentative="1">
-      <w:start w:val="1"/>
-      <w:numFmt w:val="decimal"/>
-      <w:lvlText w:val="%8."/>
-      <w:lvlJc w:val="left"/>
-      <w:pPr>
-        <w:tabs>
-          <w:tab w:val="num" w:pos="5760"/>
-        </w:tabs>
-        <w:ind w:left="5760" w:hanging="360"/>
-      </w:pPr>
-    </w:lvl>
-    <w:lvl w:ilvl="8" w:tentative="1">
-      <w:start w:val="1"/>
-      <w:numFmt w:val="decimal"/>
-      <w:lvlText w:val="%9."/>
-      <w:lvlJc w:val="left"/>
-      <w:pPr>
-        <w:tabs>
-          <w:tab w:val="num" w:pos="6480"/>
-        </w:tabs>
-        <w:ind w:left="6480" w:hanging="360"/>
-      </w:pPr>
-    </w:lvl>
-  </w:abstractNum>
-  <w:abstractNum w:abstractNumId="12">
-    <w:nsid w:val="64EC0092"/>
-    <w:multiLevelType w:val="multilevel"/>
-    <w:tmpl w:val="D88E7B7E"/>
+    <w:tmpl w:val="164EF1B2"/>
     <w:lvl w:ilvl="0">
       <w:start w:val="1"/>
       <w:numFmt w:val="bullet"/>
@@ -14022,7 +13656,7 @@
         <w:sz w:val="20"/>
       </w:rPr>
     </w:lvl>
-    <w:lvl w:ilvl="1">
+    <w:lvl w:ilvl="1" w:tentative="1">
       <w:start w:val="1"/>
       <w:numFmt w:val="bullet"/>
       <w:lvlText w:val="o"/>
@@ -14151,500 +13785,47 @@
       </w:rPr>
     </w:lvl>
   </w:abstractNum>
-  <w:abstractNum w:abstractNumId="13">
-    <w:nsid w:val="6A4809B5"/>
-    <w:multiLevelType w:val="multilevel"/>
-    <w:tmpl w:val="1E1C82E8"/>
-    <w:lvl w:ilvl="0">
-      <w:start w:val="1"/>
-      <w:numFmt w:val="bullet"/>
-      <w:lvlText w:val=""/>
-      <w:lvlJc w:val="left"/>
-      <w:pPr>
-        <w:tabs>
-          <w:tab w:val="num" w:pos="720"/>
-        </w:tabs>
-        <w:ind w:left="720" w:hanging="360"/>
-      </w:pPr>
-      <w:rPr>
-        <w:rFonts w:ascii="Symbol" w:hAnsi="Symbol" w:hint="default"/>
-        <w:sz w:val="20"/>
-      </w:rPr>
-    </w:lvl>
-    <w:lvl w:ilvl="1" w:tentative="1">
-      <w:start w:val="1"/>
-      <w:numFmt w:val="bullet"/>
-      <w:lvlText w:val="o"/>
-      <w:lvlJc w:val="left"/>
-      <w:pPr>
-        <w:tabs>
-          <w:tab w:val="num" w:pos="1440"/>
-        </w:tabs>
-        <w:ind w:left="1440" w:hanging="360"/>
-      </w:pPr>
-      <w:rPr>
-        <w:rFonts w:ascii="Courier New" w:hAnsi="Courier New" w:hint="default"/>
-        <w:sz w:val="20"/>
-      </w:rPr>
-    </w:lvl>
-    <w:lvl w:ilvl="2" w:tentative="1">
-      <w:start w:val="1"/>
-      <w:numFmt w:val="bullet"/>
-      <w:lvlText w:val=""/>
-      <w:lvlJc w:val="left"/>
-      <w:pPr>
-        <w:tabs>
-          <w:tab w:val="num" w:pos="2160"/>
-        </w:tabs>
-        <w:ind w:left="2160" w:hanging="360"/>
-      </w:pPr>
-      <w:rPr>
-        <w:rFonts w:ascii="Wingdings" w:hAnsi="Wingdings" w:hint="default"/>
-        <w:sz w:val="20"/>
-      </w:rPr>
-    </w:lvl>
-    <w:lvl w:ilvl="3" w:tentative="1">
-      <w:start w:val="1"/>
-      <w:numFmt w:val="bullet"/>
-      <w:lvlText w:val=""/>
-      <w:lvlJc w:val="left"/>
-      <w:pPr>
-        <w:tabs>
-          <w:tab w:val="num" w:pos="2880"/>
-        </w:tabs>
-        <w:ind w:left="2880" w:hanging="360"/>
-      </w:pPr>
-      <w:rPr>
-        <w:rFonts w:ascii="Wingdings" w:hAnsi="Wingdings" w:hint="default"/>
-        <w:sz w:val="20"/>
-      </w:rPr>
-    </w:lvl>
-    <w:lvl w:ilvl="4" w:tentative="1">
-      <w:start w:val="1"/>
-      <w:numFmt w:val="bullet"/>
-      <w:lvlText w:val=""/>
-      <w:lvlJc w:val="left"/>
-      <w:pPr>
-        <w:tabs>
-          <w:tab w:val="num" w:pos="3600"/>
-        </w:tabs>
-        <w:ind w:left="3600" w:hanging="360"/>
-      </w:pPr>
-      <w:rPr>
-        <w:rFonts w:ascii="Wingdings" w:hAnsi="Wingdings" w:hint="default"/>
-        <w:sz w:val="20"/>
-      </w:rPr>
-    </w:lvl>
-    <w:lvl w:ilvl="5" w:tentative="1">
-      <w:start w:val="1"/>
-      <w:numFmt w:val="bullet"/>
-      <w:lvlText w:val=""/>
-      <w:lvlJc w:val="left"/>
-      <w:pPr>
-        <w:tabs>
-          <w:tab w:val="num" w:pos="4320"/>
-        </w:tabs>
-        <w:ind w:left="4320" w:hanging="360"/>
-      </w:pPr>
-      <w:rPr>
-        <w:rFonts w:ascii="Wingdings" w:hAnsi="Wingdings" w:hint="default"/>
-        <w:sz w:val="20"/>
-      </w:rPr>
-    </w:lvl>
-    <w:lvl w:ilvl="6" w:tentative="1">
-      <w:start w:val="1"/>
-      <w:numFmt w:val="bullet"/>
-      <w:lvlText w:val=""/>
-      <w:lvlJc w:val="left"/>
-      <w:pPr>
-        <w:tabs>
-          <w:tab w:val="num" w:pos="5040"/>
-        </w:tabs>
-        <w:ind w:left="5040" w:hanging="360"/>
-      </w:pPr>
-      <w:rPr>
-        <w:rFonts w:ascii="Wingdings" w:hAnsi="Wingdings" w:hint="default"/>
-        <w:sz w:val="20"/>
-      </w:rPr>
-    </w:lvl>
-    <w:lvl w:ilvl="7" w:tentative="1">
-      <w:start w:val="1"/>
-      <w:numFmt w:val="bullet"/>
-      <w:lvlText w:val=""/>
-      <w:lvlJc w:val="left"/>
-      <w:pPr>
-        <w:tabs>
-          <w:tab w:val="num" w:pos="5760"/>
-        </w:tabs>
-        <w:ind w:left="5760" w:hanging="360"/>
-      </w:pPr>
-      <w:rPr>
-        <w:rFonts w:ascii="Wingdings" w:hAnsi="Wingdings" w:hint="default"/>
-        <w:sz w:val="20"/>
-      </w:rPr>
-    </w:lvl>
-    <w:lvl w:ilvl="8" w:tentative="1">
-      <w:start w:val="1"/>
-      <w:numFmt w:val="bullet"/>
-      <w:lvlText w:val=""/>
-      <w:lvlJc w:val="left"/>
-      <w:pPr>
-        <w:tabs>
-          <w:tab w:val="num" w:pos="6480"/>
-        </w:tabs>
-        <w:ind w:left="6480" w:hanging="360"/>
-      </w:pPr>
-      <w:rPr>
-        <w:rFonts w:ascii="Wingdings" w:hAnsi="Wingdings" w:hint="default"/>
-        <w:sz w:val="20"/>
-      </w:rPr>
-    </w:lvl>
-  </w:abstractNum>
-  <w:abstractNum w:abstractNumId="14">
-    <w:nsid w:val="79BB5B10"/>
-    <w:multiLevelType w:val="multilevel"/>
-    <w:tmpl w:val="7F984CDE"/>
-    <w:lvl w:ilvl="0">
-      <w:start w:val="1"/>
-      <w:numFmt w:val="bullet"/>
-      <w:lvlText w:val=""/>
-      <w:lvlJc w:val="left"/>
-      <w:pPr>
-        <w:tabs>
-          <w:tab w:val="num" w:pos="720"/>
-        </w:tabs>
-        <w:ind w:left="720" w:hanging="360"/>
-      </w:pPr>
-      <w:rPr>
-        <w:rFonts w:ascii="Symbol" w:hAnsi="Symbol" w:hint="default"/>
-        <w:sz w:val="20"/>
-      </w:rPr>
-    </w:lvl>
-    <w:lvl w:ilvl="1" w:tentative="1">
-      <w:start w:val="1"/>
-      <w:numFmt w:val="bullet"/>
-      <w:lvlText w:val="o"/>
-      <w:lvlJc w:val="left"/>
-      <w:pPr>
-        <w:tabs>
-          <w:tab w:val="num" w:pos="1440"/>
-        </w:tabs>
-        <w:ind w:left="1440" w:hanging="360"/>
-      </w:pPr>
-      <w:rPr>
-        <w:rFonts w:ascii="Courier New" w:hAnsi="Courier New" w:hint="default"/>
-        <w:sz w:val="20"/>
-      </w:rPr>
-    </w:lvl>
-    <w:lvl w:ilvl="2" w:tentative="1">
-      <w:start w:val="1"/>
-      <w:numFmt w:val="bullet"/>
-      <w:lvlText w:val=""/>
-      <w:lvlJc w:val="left"/>
-      <w:pPr>
-        <w:tabs>
-          <w:tab w:val="num" w:pos="2160"/>
-        </w:tabs>
-        <w:ind w:left="2160" w:hanging="360"/>
-      </w:pPr>
-      <w:rPr>
-        <w:rFonts w:ascii="Wingdings" w:hAnsi="Wingdings" w:hint="default"/>
-        <w:sz w:val="20"/>
-      </w:rPr>
-    </w:lvl>
-    <w:lvl w:ilvl="3" w:tentative="1">
-      <w:start w:val="1"/>
-      <w:numFmt w:val="bullet"/>
-      <w:lvlText w:val=""/>
-      <w:lvlJc w:val="left"/>
-      <w:pPr>
-        <w:tabs>
-          <w:tab w:val="num" w:pos="2880"/>
-        </w:tabs>
-        <w:ind w:left="2880" w:hanging="360"/>
-      </w:pPr>
-      <w:rPr>
-        <w:rFonts w:ascii="Wingdings" w:hAnsi="Wingdings" w:hint="default"/>
-        <w:sz w:val="20"/>
-      </w:rPr>
-    </w:lvl>
-    <w:lvl w:ilvl="4" w:tentative="1">
-      <w:start w:val="1"/>
-      <w:numFmt w:val="bullet"/>
-      <w:lvlText w:val=""/>
-      <w:lvlJc w:val="left"/>
-      <w:pPr>
-        <w:tabs>
-          <w:tab w:val="num" w:pos="3600"/>
-        </w:tabs>
-        <w:ind w:left="3600" w:hanging="360"/>
-      </w:pPr>
-      <w:rPr>
-        <w:rFonts w:ascii="Wingdings" w:hAnsi="Wingdings" w:hint="default"/>
-        <w:sz w:val="20"/>
-      </w:rPr>
-    </w:lvl>
-    <w:lvl w:ilvl="5" w:tentative="1">
-      <w:start w:val="1"/>
-      <w:numFmt w:val="bullet"/>
-      <w:lvlText w:val=""/>
-      <w:lvlJc w:val="left"/>
-      <w:pPr>
-        <w:tabs>
-          <w:tab w:val="num" w:pos="4320"/>
-        </w:tabs>
-        <w:ind w:left="4320" w:hanging="360"/>
-      </w:pPr>
-      <w:rPr>
-        <w:rFonts w:ascii="Wingdings" w:hAnsi="Wingdings" w:hint="default"/>
-        <w:sz w:val="20"/>
-      </w:rPr>
-    </w:lvl>
-    <w:lvl w:ilvl="6" w:tentative="1">
-      <w:start w:val="1"/>
-      <w:numFmt w:val="bullet"/>
-      <w:lvlText w:val=""/>
-      <w:lvlJc w:val="left"/>
-      <w:pPr>
-        <w:tabs>
-          <w:tab w:val="num" w:pos="5040"/>
-        </w:tabs>
-        <w:ind w:left="5040" w:hanging="360"/>
-      </w:pPr>
-      <w:rPr>
-        <w:rFonts w:ascii="Wingdings" w:hAnsi="Wingdings" w:hint="default"/>
-        <w:sz w:val="20"/>
-      </w:rPr>
-    </w:lvl>
-    <w:lvl w:ilvl="7" w:tentative="1">
-      <w:start w:val="1"/>
-      <w:numFmt w:val="bullet"/>
-      <w:lvlText w:val=""/>
-      <w:lvlJc w:val="left"/>
-      <w:pPr>
-        <w:tabs>
-          <w:tab w:val="num" w:pos="5760"/>
-        </w:tabs>
-        <w:ind w:left="5760" w:hanging="360"/>
-      </w:pPr>
-      <w:rPr>
-        <w:rFonts w:ascii="Wingdings" w:hAnsi="Wingdings" w:hint="default"/>
-        <w:sz w:val="20"/>
-      </w:rPr>
-    </w:lvl>
-    <w:lvl w:ilvl="8" w:tentative="1">
-      <w:start w:val="1"/>
-      <w:numFmt w:val="bullet"/>
-      <w:lvlText w:val=""/>
-      <w:lvlJc w:val="left"/>
-      <w:pPr>
-        <w:tabs>
-          <w:tab w:val="num" w:pos="6480"/>
-        </w:tabs>
-        <w:ind w:left="6480" w:hanging="360"/>
-      </w:pPr>
-      <w:rPr>
-        <w:rFonts w:ascii="Wingdings" w:hAnsi="Wingdings" w:hint="default"/>
-        <w:sz w:val="20"/>
-      </w:rPr>
-    </w:lvl>
-  </w:abstractNum>
-  <w:abstractNum w:abstractNumId="15">
-    <w:nsid w:val="7D101A7E"/>
-    <w:multiLevelType w:val="multilevel"/>
-    <w:tmpl w:val="164EF1B2"/>
-    <w:lvl w:ilvl="0">
-      <w:start w:val="1"/>
-      <w:numFmt w:val="bullet"/>
-      <w:lvlText w:val=""/>
-      <w:lvlJc w:val="left"/>
-      <w:pPr>
-        <w:tabs>
-          <w:tab w:val="num" w:pos="720"/>
-        </w:tabs>
-        <w:ind w:left="720" w:hanging="360"/>
-      </w:pPr>
-      <w:rPr>
-        <w:rFonts w:ascii="Symbol" w:hAnsi="Symbol" w:hint="default"/>
-        <w:sz w:val="20"/>
-      </w:rPr>
-    </w:lvl>
-    <w:lvl w:ilvl="1" w:tentative="1">
-      <w:start w:val="1"/>
-      <w:numFmt w:val="bullet"/>
-      <w:lvlText w:val="o"/>
-      <w:lvlJc w:val="left"/>
-      <w:pPr>
-        <w:tabs>
-          <w:tab w:val="num" w:pos="1440"/>
-        </w:tabs>
-        <w:ind w:left="1440" w:hanging="360"/>
-      </w:pPr>
-      <w:rPr>
-        <w:rFonts w:ascii="Courier New" w:hAnsi="Courier New" w:hint="default"/>
-        <w:sz w:val="20"/>
-      </w:rPr>
-    </w:lvl>
-    <w:lvl w:ilvl="2" w:tentative="1">
-      <w:start w:val="1"/>
-      <w:numFmt w:val="bullet"/>
-      <w:lvlText w:val=""/>
-      <w:lvlJc w:val="left"/>
-      <w:pPr>
-        <w:tabs>
-          <w:tab w:val="num" w:pos="2160"/>
-        </w:tabs>
-        <w:ind w:left="2160" w:hanging="360"/>
-      </w:pPr>
-      <w:rPr>
-        <w:rFonts w:ascii="Wingdings" w:hAnsi="Wingdings" w:hint="default"/>
-        <w:sz w:val="20"/>
-      </w:rPr>
-    </w:lvl>
-    <w:lvl w:ilvl="3" w:tentative="1">
-      <w:start w:val="1"/>
-      <w:numFmt w:val="bullet"/>
-      <w:lvlText w:val=""/>
-      <w:lvlJc w:val="left"/>
-      <w:pPr>
-        <w:tabs>
-          <w:tab w:val="num" w:pos="2880"/>
-        </w:tabs>
-        <w:ind w:left="2880" w:hanging="360"/>
-      </w:pPr>
-      <w:rPr>
-        <w:rFonts w:ascii="Wingdings" w:hAnsi="Wingdings" w:hint="default"/>
-        <w:sz w:val="20"/>
-      </w:rPr>
-    </w:lvl>
-    <w:lvl w:ilvl="4" w:tentative="1">
-      <w:start w:val="1"/>
-      <w:numFmt w:val="bullet"/>
-      <w:lvlText w:val=""/>
-      <w:lvlJc w:val="left"/>
-      <w:pPr>
-        <w:tabs>
-          <w:tab w:val="num" w:pos="3600"/>
-        </w:tabs>
-        <w:ind w:left="3600" w:hanging="360"/>
-      </w:pPr>
-      <w:rPr>
-        <w:rFonts w:ascii="Wingdings" w:hAnsi="Wingdings" w:hint="default"/>
-        <w:sz w:val="20"/>
-      </w:rPr>
-    </w:lvl>
-    <w:lvl w:ilvl="5" w:tentative="1">
-      <w:start w:val="1"/>
-      <w:numFmt w:val="bullet"/>
-      <w:lvlText w:val=""/>
-      <w:lvlJc w:val="left"/>
-      <w:pPr>
-        <w:tabs>
-          <w:tab w:val="num" w:pos="4320"/>
-        </w:tabs>
-        <w:ind w:left="4320" w:hanging="360"/>
-      </w:pPr>
-      <w:rPr>
-        <w:rFonts w:ascii="Wingdings" w:hAnsi="Wingdings" w:hint="default"/>
-        <w:sz w:val="20"/>
-      </w:rPr>
-    </w:lvl>
-    <w:lvl w:ilvl="6" w:tentative="1">
-      <w:start w:val="1"/>
-      <w:numFmt w:val="bullet"/>
-      <w:lvlText w:val=""/>
-      <w:lvlJc w:val="left"/>
-      <w:pPr>
-        <w:tabs>
-          <w:tab w:val="num" w:pos="5040"/>
-        </w:tabs>
-        <w:ind w:left="5040" w:hanging="360"/>
-      </w:pPr>
-      <w:rPr>
-        <w:rFonts w:ascii="Wingdings" w:hAnsi="Wingdings" w:hint="default"/>
-        <w:sz w:val="20"/>
-      </w:rPr>
-    </w:lvl>
-    <w:lvl w:ilvl="7" w:tentative="1">
-      <w:start w:val="1"/>
-      <w:numFmt w:val="bullet"/>
-      <w:lvlText w:val=""/>
-      <w:lvlJc w:val="left"/>
-      <w:pPr>
-        <w:tabs>
-          <w:tab w:val="num" w:pos="5760"/>
-        </w:tabs>
-        <w:ind w:left="5760" w:hanging="360"/>
-      </w:pPr>
-      <w:rPr>
-        <w:rFonts w:ascii="Wingdings" w:hAnsi="Wingdings" w:hint="default"/>
-        <w:sz w:val="20"/>
-      </w:rPr>
-    </w:lvl>
-    <w:lvl w:ilvl="8" w:tentative="1">
-      <w:start w:val="1"/>
-      <w:numFmt w:val="bullet"/>
-      <w:lvlText w:val=""/>
-      <w:lvlJc w:val="left"/>
-      <w:pPr>
-        <w:tabs>
-          <w:tab w:val="num" w:pos="6480"/>
-        </w:tabs>
-        <w:ind w:left="6480" w:hanging="360"/>
-      </w:pPr>
-      <w:rPr>
-        <w:rFonts w:ascii="Wingdings" w:hAnsi="Wingdings" w:hint="default"/>
-        <w:sz w:val="20"/>
-      </w:rPr>
-    </w:lvl>
-  </w:abstractNum>
   <w:num w:numId="1">
-    <w:abstractNumId w:val="12"/>
+    <w:abstractNumId w:val="10"/>
   </w:num>
   <w:num w:numId="2">
-    <w:abstractNumId w:val="14"/>
+    <w:abstractNumId w:val="12"/>
   </w:num>
   <w:num w:numId="3">
     <w:abstractNumId w:val="0"/>
   </w:num>
   <w:num w:numId="4">
+    <w:abstractNumId w:val="6"/>
+  </w:num>
+  <w:num w:numId="5">
+    <w:abstractNumId w:val="3"/>
+  </w:num>
+  <w:num w:numId="6">
+    <w:abstractNumId w:val="11"/>
+  </w:num>
+  <w:num w:numId="7">
+    <w:abstractNumId w:val="9"/>
+  </w:num>
+  <w:num w:numId="8">
+    <w:abstractNumId w:val="5"/>
+  </w:num>
+  <w:num w:numId="9">
+    <w:abstractNumId w:val="2"/>
+  </w:num>
+  <w:num w:numId="10">
+    <w:abstractNumId w:val="1"/>
+  </w:num>
+  <w:num w:numId="11">
     <w:abstractNumId w:val="8"/>
   </w:num>
-  <w:num w:numId="5">
-    <w:abstractNumId w:val="5"/>
+  <w:num w:numId="12">
+    <w:abstractNumId w:val="4"/>
   </w:num>
-  <w:num w:numId="6">
-    <w:abstractNumId w:val="13"/>
-  </w:num>
-  <w:num w:numId="7">
-    <w:abstractNumId w:val="11"/>
-  </w:num>
-  <w:num w:numId="8">
+  <w:num w:numId="13">
     <w:abstractNumId w:val="7"/>
   </w:num>
-  <w:num w:numId="9">
-    <w:abstractNumId w:val="3"/>
-  </w:num>
-  <w:num w:numId="10">
-    <w:abstractNumId w:val="2"/>
-  </w:num>
-  <w:num w:numId="11">
-    <w:abstractNumId w:val="10"/>
-  </w:num>
-  <w:num w:numId="12">
-    <w:abstractNumId w:val="6"/>
-  </w:num>
-  <w:num w:numId="13">
-    <w:abstractNumId w:val="9"/>
-  </w:num>
   <w:num w:numId="14">
-    <w:abstractNumId w:val="15"/>
-  </w:num>
-  <w:num w:numId="15">
-    <w:abstractNumId w:val="4"/>
-  </w:num>
-  <w:num w:numId="16">
-    <w:abstractNumId w:val="1"/>
+    <w:abstractNumId w:val="13"/>
   </w:num>
 </w:numbering>
 </file>
@@ -15341,7 +14522,7 @@
   <a:extraClrSchemeLst/>
   <a:extLst>
     <a:ext uri="{05A4C25C-085E-4340-85A3-A5531E510DB2}">
-      <thm15:themeFamily xmlns="" xmlns:thm15="http://schemas.microsoft.com/office/thememl/2012/main" name="Office Theme" id="{62F939B6-93AF-4DB8-9C6B-D6C7DFDC589F}" vid="{4A3C46E8-61CC-4603-A589-7422A47A8E4A}"/>
+      <thm15:themeFamily xmlns:thm15="http://schemas.microsoft.com/office/thememl/2012/main" xmlns="" name="Office Theme" id="{62F939B6-93AF-4DB8-9C6B-D6C7DFDC589F}" vid="{4A3C46E8-61CC-4603-A589-7422A47A8E4A}"/>
     </a:ext>
   </a:extLst>
 </a:theme>

</xml_diff>